<commit_message>
Center document pages when the comment gutter is empty
</commit_message>
<xml_diff>
--- a/docs/images/arcade-doom-ascii-frame.docx
+++ b/docs/images/arcade-doom-ascii-frame.docx
@@ -110,67 +110,65 @@
           <w:sz w:val="4"/>
           <w:szCs w:val="4"/>
         </w:rPr>
-        <w:t xml:space="preserve">|:'''''''''---''''''::'''::::::''''''''''':''''''':'''''''''''''':''''''':'''''''''::::::''''':::''''''---''''''''''''--------''''''''''''''':::''''::::'''''''''''':::'''''''''''''''''''''''''''''-----''':::'''''':::''':::'''''''':'''''''''''''''--------'''''''''''''''::'''''''''''''''''---''''''''''''''':::::'''''':::'</w:t>
-        <w:br/>
-        <w:t xml:space="preserve">|'''''''''''---'''''''':::':::::::''''''::':::'''''':::'''''''''''''''''''''''''''':::::::::::':::'''''---'''''''''''''''''--------'''''''''''''''''''''''''''''''''''''''''''''''''''''''---''''''-----''''':'''::::::'''''''''''''':::''''''''''''''''''-------'''''''''''''''''''''''''''''---'''''''''''''''''''''''''''::'''</w:t>
-        <w:br/>
-        <w:t xml:space="preserve">|''''''''''''---'''''''':::''':::::'''::::::''':':::'''''''''''''''''''''''''''''''''::::::::::''''''''---''''''''''''''''''''''''-------''''''''''''''''''''''''''''''''''''''':::''''''''''''''---------'''::'''::::::''':::::'''''':::''''''''''''''''''''''-------''''''''''''''''''''''--''''''''''''''''''''''':::'''''''''</w:t>
-        <w:br/>
-        <w:t xml:space="preserve">|'':''''''''''---''''''''':::::'':::''''::''''''::'''''''''''''''''''''''''''''''''''':::''::::''''''''---'''''''''''''''''''''''''''''-------''''''''''''''''''''''''''''''':::::''''''''''''''---------''''':''::::::''''''':''':::::'''''''''''''''''''''''''''--------''''''''''''''''--''''''''''''''''''''''''':''::::'''''</w:t>
-        <w:br/>
-        <w:t xml:space="preserve">|''':::''''''''---'''''''''''::''''''''''':::''''''::'''''''''''''''''''''':'''''''''''''''''''''''''''---''''''''''''''::'''''''''--'''''''-------'''''''''''''''''''''''''::::::::'''''''''''--------'''''':::'''':'''''''':::'':''''':'''''''''''''''''''''''''''''-------''''''''''---'''''''''''''''''''''''''::::::::'''':'</w:t>
-        <w:br/>
-        <w:t xml:space="preserve">|:'''''':::'''''---'''''''':::'''''''''''''''''''::''''''''''''''''''''''::'::'''''''''::''''''''---'''---''''''''''''''''::''''''-----''''''''''--------'''''''''''''''''''''::''''''''''''''---'''''''':':::''''''::::''''''''''''::'::''''''::'''''''''''''''''''''''''-------'---..''''''''''''''''''''''''':::':''':::'':::'</w:t>
-        <w:br/>
-        <w:t xml:space="preserve">|::::''''''''''''---'''''''''''::'''''''''''''''''''::'::'''''''':::::::::':''':::''''''':''''''''--'''---''''''''''''':::'':''''''--'''''''''''''''''''-------''''''''''''''''''''''''''''''---''''':::'::''''':::''''::::'''''''''':::::::'''':::'''''::'''''''''''''''''''''-......''''''''''''':''''''''''''':'''''''''''''''</w:t>
-        <w:br/>
-        <w:t xml:space="preserve">|''''''''''''-----...-----'''''''''''''''''''''''''''''''''''''''''''''''''''''''''''''''''''''--------...-----'''''''''''''''''''-----''--------------------.......--------------''--------...-----'''''''''''''---'-'''''''''''''''''''''''''''''''''''''''''''''''---------.....------''''''''''''''''''''''''''---'''''''''''</w:t>
-        <w:br/>
-        <w:t xml:space="preserve">|'''''''''''''-----...-----'''''-'''''''''''''''''''''''--''''''''''''''''---'''''''''''''''''''''-----..------''''''''''''''''''''''''''''''''''''''--------------.......----------------...-----''''''''''''''''''''''''''''''''''''''''''''''''''''''''''''''''''''--------...-----''''''''''''''''''''''''''''-''''''''''''''</w:t>
-        <w:br/>
-        <w:t xml:space="preserve">|''''''''''''''-----...-----''''''--'''''''''''''''''''''''''''''''''---'''''---''''''''''--''''''-----..------''''''''''''''''''''''''''''''''''''''-------------------.......----------...-----'''''---''''''''''''''''''''''''''''''''''''''''''''''''''''''-'''''''-----..------'''''''''''''''''''''''''''''''''-'''''''''''</w:t>
-        <w:br/>
-        <w:t xml:space="preserve">|'''''''''''''''-----...-----'''''''''''''''''''''''''''''''''''''''''--'''''---''''''''''''''''''-----..------'''''''''''''''''''''''''''''''''--''''''''--------------------.......-.....-----''''''''''''''''''--'''''''''''''''''''''''---''''''''''''''''--'''''-----..--------'''''''''''''''''''''''''''''''-----''''''''-</w:t>
-        <w:br/>
-        <w:t xml:space="preserve">|''''''''''''''--...--...-----''''''''''''''''''''''''''''''''''''''''----'---''''''''''''''''''''-----..-----'''''''''''''''''''''''''''''''''''''''''''''''''-''''''-------------.......-----'''''''''''''''''''''''''''''''''''''---'''''''''''''''''''''''''''-----...-------'''''''''''''''''''''''''''''''''---''''''''''''</w:t>
-        <w:br/>
-        <w:t xml:space="preserve">|''''''''''''''''------...-----''---''''''''''''''''''''''''''''''''''--------''''''''''''''''''''-----..-----'''''''''''''''''''''''''''''''''''''''''''''''''''''''''''''--------.....-----'''''''''''''''''''''''''''''''''''''-----'''''''''''''''''''''''''-----..-----...--''''''''''''''''''''''''''''''''''''''''''''''''</w:t>
-        <w:br/>
-        <w:t xml:space="preserve">|'''''''''''''''''''-----..-------'''''''''''''''''''''''''''''''''''''-----''''''''''''''''''''''-----..-----''''''''''''''''''''''''''''''''''''''''''''''''''''''''''''''''-------..-----''''''''''''''''''''''''''''''''''''''''''''''''''''''''''''''''''-----...-----..----''''''''''''''''''''''''''''''''''''''''''''''''</w:t>
-        <w:br/>
-        <w:t xml:space="preserve">|'''''''''''''--''--'-----..-------''''''''''''''''''''''''''''''''''''--------'''''''''''''''''''-----..-----'''''--'''''''''''''''''''''''''''''''''''''''''''''''''''--'''''-----..-----'''''''''''''''''''''''''''''''''''''''-'''''''''''''''''''''''''-----..--------''''''''''''''''''''''''''''''''''''''''''''''''''''''</w:t>
-        <w:br/>
-        <w:t xml:space="preserve">|'''''''''''''''''''-------..-----''''''''''''''''---''''''''''''--'''''''--'----'''''''''''''''''-----..-----''''''''''''''''''''''''''''''''''''''''''''''''''''''''''''''''----...-----''''''''''''''''''''''''''''''''''''''''''''''''''''''''''''''''----...----''-''''''''''''''''''''''''''''''''''''''''''''''''''''''---</w:t>
-        <w:br/>
-        <w:t xml:space="preserve">|''''''''''''''''''''--.----..-----''''---'''''''''-----'''''''''''''''''''--'''''''''''''''''''''-----..-----'''''''''''''''''''''''''''''''''''''''''''''''''''''''''''''''----...----'''''''''''''''''''''--'''''''''''''--''''''''''''''''''''''''''----...----''''''''''''''''''''''''''''''''''''''''''''''''''''''''''''''</w:t>
-        <w:br/>
-        <w:t xml:space="preserve">|'''''''''''''''''''''----.--..-----''''''''''''''''''''''''''''''''''''''''''''''''''''''''-'''------...----'''''''''''''''''''''''''''''''''''''''''''''''''''''''''''''''----..-----'''''--'''''''''''---''''''''''''''''''''''''''''''''''---''''-----..-----''''''''''''''''''''''''''''''''''''''''''''''''''''''''''''''--</w:t>
-        <w:br/>
-        <w:t xml:space="preserve">|''''''''''''''''''''----.......-----'''''''''''''''''''''''''''''''''''''''--''''''''''''''''''''-----..----''''''''''''''''''''''''''''''''''''''''''''''''''''''''''''''----...----''''''''''''''--''---''''''''''''''''''''''''''''''''''''''''-----..-----''''-''''''''''''''''''''''''''''''''''''''''''''''''''''''''-----</w:t>
-        <w:br/>
-        <w:t xml:space="preserve">|'''''''''''''''''''''''---......-----''''''''''''''''''''''''''''''''''''''''''''''''''''''''''-------..----'''''''''''''''''''''''''''''''''''''''''''''''''''''''''''''----..-----''''''''''''''''''''''''''''''''''''''''--'''--'''''''''''''-----..----''''''-''''''''''''''''''''''''''''''''''''''''''''''''''''''----....</w:t>
-        <w:br/>
-        <w:t xml:space="preserve">|''''''''''-'''''''''--'''''--....-----''''''''''''''''''''''''--'''''''''''''''''''''''''''''--.-..--...----''''-''''''''''''''''''''''''''''''''''''''''''''''''''''''-----..----''''''''''''''''''''''''''''''''''''''------''''''''''''''''----..------''''''''''''''''''''''''''''''''''''''''-''''''''''-''''''----...-----</w:t>
-        <w:br/>
-        <w:t xml:space="preserve">|''''''-----'''''''''''''''''----..-----''''''''''''''''''''''''''''''''''''''''''''''''''''''----.---...----''''''''''''''''''''''''''''''''''''''''''''''''''''--''''-----..----'''''''''''''''''''''''''''''''''''''-------''''''''''''-''----....------''''''''''''--'''''''''''''''''''''''''-''''''''''-''''----..---------</w:t>
-        <w:br/>
-        <w:t xml:space="preserve">|'--'''''--..--''-------''----...........----'.''-------'-''----------------------------------'-.............------''''----------------------------''-------''''------...........----''-----------'-''---------''--''------'''''------''--............................--''--'''''..------''-.---'------'--''''...........--------</w:t>
-        <w:br/>
-        <w:t xml:space="preserve">|'--..--''-'--'''''------------...........------''''----''.....-------------------------''''..--''...........----------------''-----''----''------'-..--'''------''''...........''--..''-------'--..-''--------''---'''---''--'-''..--''.............................---''--''''''------''-.-------..----.............----..----'</w:t>
-        <w:br/>
-        <w:t xml:space="preserve">|---'---'-''---'----------------...........---------'-----'--''''-------------------------''--'-''..........-----------------..''''--..--.-''---------....''--''--..............'''--''''----''-'--''''---------------------''''''''-'.....................................-------------------------..............--'''''''----'-</w:t>
-        <w:br/>
-        <w:t xml:space="preserve">|----------------''--------------..........-----------''....-.--''---------------------------'--............----------------'---'''..--''--'-------''--..''----''-.............--''--------'-..-----------------------------''---'............------''..........................----------''''''----.............--''''''------'-</w:t>
-        <w:br/>
-        <w:t xml:space="preserve">|----------------''''----''''..----............--..''-''------''----------------------------------..........----..''------------''....''-'----------''''''''..--''...........-''--------------''--------..------''''------''..--............----.---''...............................-----''------..........--'-''---''''--------</w:t>
-        <w:br/>
-        <w:t xml:space="preserve">|------------'--------------''------...........----''''----''------------------------------''.----..........------''''--------------''-'---------------''''''----..........--''-'--------------'--------''''----''-'------''''...........----'''''-''''....-...............................-............------'---....--'-------'</w:t>
-        <w:br/>
-        <w:t xml:space="preserve">|'-----------------------------------................-----''---'-----''..--------''''----'''''----..........''--.-''--'''--------------------''-------------''''.........----..''------------''-----''--..''--..''--'-'..--''..........-------''----''''''---'------................................----..----''''-----------::::</w:t>
-        <w:br/>
-        <w:t xml:space="preserve">|-'-''---------------''''-------------..........................--'---''''''--'--.-..-------------..........---'-..-...--''-----------------.---'--------''--...........''''--''''------------'---''--..--....--'''''-'----.........---------------------''''..--'-----...--.....................----''''---''..--'------::::::::</w:t>
-        <w:br/>
-        <w:t xml:space="preserve">|'..-----------------'--..''--''''.----.................................--------''--.-'-----------..........-------''''-'-----------------------'---------''--.............-'------------------''''--...----''-----------.........---------------'''''-----'--------'''-----------...........---------'--------------::::::::::::</w:t>
+        <w:t xml:space="preserve">|''''''''''''''''''''''''''''''':::''::::::'''''''''':::'''''':::'''''''''''::::'':'''''''''---''''''''''''''''''''''''''''''''''''''''''''''''''''''''''''''''''''''''''''''''''''''''''''---''''''''''''''''''''''''''::::::''':''''''''''''':''''''''':::''''''''''''''''''''''''''''''---''''''''''':'':::'''''''''''''''''''</w:t>
+        <w:br/>
+        <w:t xml:space="preserve">|''''''''''''''''''''''''''''''''''''''''':::'''''''''':'''''':::''''''''':'':::''''''''''''---'''''''''''''''''''''''''''''''''''''''''''''''''''''''''''''''''''''''''''''''''''''''''''--''''''''''''''''''''':'':::'::'''''':::'''''''':''''':'':::'::'''''''''''''''''''''''''''''---''''''''''''::::::'''''''''''''''''''''</w:t>
+        <w:br/>
+        <w:t xml:space="preserve">|-''''''''''''''''''''''''''''''''''':::::''':::''''''''':::'''''':''''''':::'''''''''''''''---''''''''''''''''''''''''''''''''''''''''''''''''''''''''''''''''''''''''''''''''''''''''''--''''''''''''::':::''':::'':'''''''':::''''''''':::''':::''''''''''''''''''''''''''''''''''---''''''''':'':::::::::''''''''''''''''''''</w:t>
+        <w:br/>
+        <w:t xml:space="preserve">|--''''''''''''''''''''''''''''''':'''''':::::'::''''''''''''''::::::''''':::''''''--'---'''--'''''''''''''''''''''''''''''''''''''''''''''''''''''''''''''''''''''''''''''''''''''''''---'''''''''''':::::::':::''':::''''':::'''''''''''':':::::''''''''''''''':::'''''''''''''''--''''''::::::''':::::''''''''''''''''''''''''</w:t>
+        <w:br/>
+        <w:t xml:space="preserve">|---''''''''''':'':::'''''''''''::::::'''''''''''''''''''''':::'''''''''''''':''''''--''''''--''''''''''''''''''''''''''''''''''''''''''''''''''''''''''''''''''''''''''''''''''''''''---'''''''''''''':::::::::''''''''''':::''''''''''':::::::::::::':::''':::::'''''''''''''''--'''''''':'''''''''''''''''''''''''''''''''''''</w:t>
+        <w:br/>
+        <w:t xml:space="preserve">|----'''''''''''::::::'''''''':::'':'':::'''''''''''''''''''''''''''''''''''''::''''''---''---'''''''''''::::::''''''''''''''''''''''''''''''''''''''''''''''''''''''''''''''''''''''---'''''''''''''''':::'''''':::'':::'':'''''''''''''':::::''''::''':''::::::::'''''''''''---'''''''''''''''''''''':::'''''''''''''''''''''''</w:t>
+        <w:br/>
+        <w:t xml:space="preserve">|''---'''''''''''''':::::''':'':::''''''':'''''''''''''''''''''''''''''''''::''''::'''''''''--'''''''''''''::::::'''''''''''''''''''''''''''''''''''''''''''''''':':::''''''''''''''---''''':::'''''''''''::':::'':::'''''''''''''''''::'''''''''''''''::'''':'''::'''''''''---''''''''''''''''''':::'':'''::''''''''''''''''''''</w:t>
+        <w:br/>
+        <w:t xml:space="preserve">|-.....------''''''''''''''''''''''--'''''''''''''''''''''''''''''''''''''''''---'''''------..------''''''''''''''''''''''''''''''''''''''''''''''''''''''''''''''''''--'''''------..------''''''''''''''''''''''''''''''''''''''''''''''--------''-''''''''''''''''------...-----'''''---'''''''''''---'''''''''''''''''''''''''</w:t>
+        <w:br/>
+        <w:t xml:space="preserve">|--.....------''''''''''''''''''''''''''''''''''''''''''''''''''''''''''''''''''''''''------..------''''''''''''''''''''''''''''''''''''''''''''''''''''''''''''''''''''''''------..--------'''''''''''''''''''''''''''''''''''''''''''--------'''''''''''''''''''------..------'''''''''''''''''''''''''''''''''''''''''''''''''</w:t>
+        <w:br/>
+        <w:t xml:space="preserve">|---.....------'''''''''''''''--------''''''''''''''''''''''''''''''''''''''''''''''''-----...-----'''''''''''''''''''''''''''''''''''''''''''''''''''--'''''''''''''''''''-----...-----''''''''''''''''''''''''''''''''''''''''---''--------''''''''''''''--'''-----...--------'''''''''''''''''''''''''''''''''''''''''''''''''</w:t>
+        <w:br/>
+        <w:t xml:space="preserve">|'------..--------'''--''''''''-----''''''''''''''''''''''''''''''''''''''''''''''''''-----...-----'''''''''''''''''''''--''''''''---'''''''''''''''''''''''''''''''''''''-----..------'''''---''''''''''''''''''''''''''''''''''''''''-'''''''''''''''''''-------......-------''''''''''''''--'''''''''''''''''''''''''''''-''''</w:t>
+        <w:br/>
+        <w:t xml:space="preserve">|'''-----..------'''''''''''''''''''''''''''''''''''''''''''''''''''''''''''''''''''-------...-----''''''''''''''''''''''''''''-'''''''---'''''''''''''-----''''''''''-''-----..------'''''''''''''''''''''''--''''''''''''''''''''''''''''''''''''''''''''-----........-----------''----''''''''''''''''''''''''''''''''''-'''''</w:t>
+        <w:br/>
+        <w:t xml:space="preserve">|''''--.....--------''''''''''''''''''''''''''''''''''''''''''''''''''''''''''''''''''-----...-----'''''-''''''''''''''''''''''--'''''''''''''''''''''-----''''''''''--------..--------''''''''''''''''''''''-'''''''''''''''''''''''''''''''''''---'''''-----.....--.....-----------------'''''''''''---''''''''''---'''''''''''</w:t>
+        <w:br/>
+        <w:t xml:space="preserve">|'''''-----.....-------'''''''''''''''''''''''''''''''''''''''''''''''''''''''''''''''-----...-----'''''''''''''''''''''''''''-----'''''''''''''''''''''''''''''''''''------..--------'''''''''''''''''''''''''''''''''''''''''''''''''''''''''''''''''-----..-----------......-----------'''''''''''''''''''''''''--''''''''''''</w:t>
+        <w:br/>
+        <w:t xml:space="preserve">|''''''-----.......-----------'''''''''''''''''''''''''''''''''''''''''''''''''--'''''-----...-----''''''''''''''''''''''''''''-''''''''''''''''''''''''''''''--'''''-----...-----''''''''''''''''''''--'''''''''''''''''''''''''''''''''''''''''''''-----..----------------......-----------'''''''''''''''''''''''''''''--'''''</w:t>
+        <w:br/>
+        <w:t xml:space="preserve">|'''''''-----.....---.....-----------'----'''''''''''--'''''''''''''''''''''''''''''''-----...-----'''''''''''''''''''''''''''''''''''''''''''''''''''''''''''''''''-----...-------''''''''''''''''''''''''''''''''--'''''''''''''''''''''''''''-------...-----'-''''-----------.....-----------''''''''''''''''''''''''''''--..-</w:t>
+        <w:br/>
+        <w:t xml:space="preserve">|'---'''''----...-----------.....-----------'''''''''''''''''''''''--'''''''''''''''''-----..-----'''''--'''''--'''''''''''''''''''''''''''''''''''''''''''''''''''-----..-----''''''''''''''''''''''''''''''''''''''''''''''-'''''''''''--''---..---..-----''''''''''''-----.-----.....-----------''''''''''''''''''------------</w:t>
+        <w:br/>
+        <w:t xml:space="preserve">|''''''''''----...-----------------.....-----------'''''''''''''''-'''''''''''''''''''-----..-----'''''''-------''''''''''''''''''''''''''''''''''''''''''''''''''-----..-----'''''-''''''''''''''''''''-''''''''''''''''''''''''''''''''''---..--...-----''''---''''''---.....-------.....-----------'''''''''''''''''''-----...</w:t>
+        <w:br/>
+        <w:t xml:space="preserve">|'''''''''''-----..----'''''''''----------......----------''''''''''--''''''''''''''''-----..-----''''''''''''''''''''''''''''''''''''''''-'''''''''''''''''''--'----...----''''''''''''''''''''''''''''''''''''''-'''''-''''''''''''''''''-----..-----''''''''''''''''-------------------.....----------'''''''''''''----...-.--</w:t>
+        <w:br/>
+        <w:t xml:space="preserve">|'''--''-''-------..-----''''-''''''''------------.....---------------''''''''''--'''''----..-----'''''--'''''''''''''''''''''''''''''''''''''''''''''''''''''--..---..----'''''''''''''''''''''''''''''''''''''---''''--''''''''''--''''-----..-----''''''''''''''''''''-'''''-''''----------.....----------''''-'-----..----'''</w:t>
+        <w:br/>
+        <w:t xml:space="preserve">|'''''''''--..-----....--'''''''''''''''''--'''----------.....-----------'''''''''''''-----..-----'''''''''''''''''''''''''''''''''''''''''''''''''''''''''''''----..------'--''''''''''''''''''''''''''''''''-------''''''''''''''''''----..-----''''''''''''''''''''''''''''''''''-------------.....-------------...----'''''''</w:t>
+        <w:br/>
+        <w:t xml:space="preserve">|''''''''''''''-----......---''''''''''''''''-''''''''----------.....----------'''''''-----..-----''''''''''''''''''''''''''''''''''''''''''''''''''''''-''--'----..-------'''''''''''''''''''''''''''''''''-----'-''''''''''''''''''----..-----'''''''''''''''''''''''''''''--''''''''--------------.....----.-..-----''''--''''</w:t>
+        <w:br/>
+        <w:t xml:space="preserve">|...-----'-------.............--''-----------''''-------------....................................----------------'-------''''----------------------''----..............--''''----'''''---------------''---......-'----------------...........-----------------''''-----''''''--'''''----'-----.....................----''''----'</w:t>
+        <w:br/>
+        <w:t xml:space="preserve">|............---.-..........'''''----''--'''''------''''...--''-.--..............................------------------'-------..----------------------''''--.............--''...-----'''.....-'----''--'-'''--..-...''-------------...........----..'''----------'''''''----------------'-------------.............------'''''----''</w:t>
+        <w:br/>
+        <w:t xml:space="preserve">|............................-------'''-..----'''------''''''--''--.--''----.....................---------------''''---------''--------'''''------''--.-.............----'''''----'''''.--''----'''----''-.--'-''-----'---''''...........------''''-----------''-----------------------''''..-----..........---------------------</w:t>
+        <w:br/>
+        <w:t xml:space="preserve">|-.............................----..'---''''-------------------'-''''--------------.............----'.''---------''..----------'-''--'''.-''------''--.............------''''-------------------------..-'------'''''''--............--------'''------------''---------------------''''''----...........------------------------</w:t>
+        <w:br/>
+        <w:t xml:space="preserve">|-''''-''------................------'''''--''..--'-------''''''''..-'------'''''.-----..........--''--''''--------''-.--'-''''-''--....--''--''''..-'--..........-------------------''--''''------''----''--------''--.-...........-------------------------------------------------------..........------------'-''-'---'----::</w:t>
+        <w:br/>
+        <w:t xml:space="preserve">|-----------'''-''--............---------'--------'--------''--....--''-'----''''''----............--''--------------''''--..--''''--..--''---'''''''--..........---------------------''''-''------''----''----''--..............------------------------------------------------------..........----''''---''--'-..-.''---::::::</w:t>
+        <w:br/>
+        <w:t xml:space="preserve">|-------------'''''.----.........------------------------------''''''------------------..............''-----------------'''-..--''----''''------------..........----''''------'-'------------------------------''..............----..''---------------------------------------------..........------''''''------'-''---::::::::""</w:t>
+        <w:br/>
+        <w:t xml:space="preserve">|------------------------.........--------------''''----------''-----''----------------...........--'.''--------------------''''---------------------..........-----''''--''''..-.-----------------------''''..''--..........-----''''---------------------------------''''..----..........''-------''-------------::::::::::::""</w:t>
       </w:r>
       <w:r>
         <w:rPr>
@@ -183,11 +181,9 @@
           <w:szCs w:val="4"/>
         </w:rPr>
         <w:br/>
-        <w:t xml:space="preserve">|.....--'--''''..-----''-.--'-----'--'-'.........--------'............................--'''''''---..........---''''---------------------------------'''''--...........-.-''----'-''----------..''''.....--''-----------.........----.''-----------''--------------------''''.----.........-----------------'-----::::::::::::::^^</w:t>
-        <w:br/>
-        <w:t xml:space="preserve">|...........-----------------------.--............----..-------..--........................--------........-----------------------------------------------...........---.--------....--------------..----------------.........------------------------------------------------.........----------------------::::::::::::::**^^^^</w:t>
-        <w:br/>
-        <w:t xml:space="preserve">|......................-------------'..--............-------------------------.............................---------------------..-----------------------..........------'-----------------------..---------------.........-----------------------------------------------.........-----''---..--..------::::::::::::::^^""**^***</w:t>
+        <w:t xml:space="preserve">|-------------------------.........----''''--''--'-..-.'------''--''-------------------.........--''''''''-------------------------'''------'-------.........------------.---.-'------------------------'''-'--''.........---------------''----''''-------------''----''------...........----------------------:::::::::::::::**"</w:t>
+        <w:br/>
+        <w:t xml:space="preserve">|--------------------------.........------''''''-'---'-''---------''''-'''-'-''''''----.........-----------'----------------''--''--'----''''''---..........-.--'''--''--..--'------------------------------...........--------------'-.--''---.--.''--------..--'--''-'--.........-'--'.''-----''----''---::::::::::::::^^^^***"</w:t>
       </w:r>
       <w:r>
         <w:rPr>
@@ -200,37 +196,35 @@
           <w:szCs w:val="4"/>
         </w:rPr>
         <w:br/>
-        <w:t xml:space="preserve">|..----...........................----------........---------------------'..-----....--....................---------------.-----------------.-----------..........-------------------------------.------------...........----------------------------------------------........----------------------:::::::::::::::::"^^"*&lt;&lt;****</w:t>
-        <w:br/>
-        <w:t xml:space="preserve">|-------------.----.---..............................--------------------------------------------..........-----''----------.----------....-------'-----.........------------------------------------------...........-----'---------------------------------''.----........----------------------:::::::::::::::"":::"^^**&lt;&lt;*??h</w:t>
-        <w:br/>
-        <w:t xml:space="preserve">|.-------------------'-..-----....-...................-----'------.---------------..--------''-----.........---------------------..------.-------------........-----''--------..-----------------------.----........-------------------------------..-----------.........---.-----------------::::::''':::^^**:::"^:::"^^**&lt;&lt;???h</w:t>
-        <w:br/>
-        <w:t xml:space="preserve">|...------------------------------------------.........-------------------------.------------------...........----------------------------------------........-------------.------------------------------........-------------.--------..--------...-------...........-------------------::::::'::'''^^^^^^*?***^^:::"****&lt;&lt;hhhh</w:t>
-        <w:br/>
-        <w:t xml:space="preserve">|.....----''------------------------------''----........--------------------------.----------------.........---''------------------------------'..---..........-..------..------------------------------.......----.-------------...-----------------.----........--------------------::::::::''':"::^^^^***??*****:::"****LLhhhh</w:t>
-        <w:br/>
-        <w:t xml:space="preserve">|.......-----------------------------------------........----.-------..---------------------'-..---.......------------------------------------------.........----------------------------------''.---........-----------------------------------------........-----------------..-:::::::'''::^^:""::**??***??*****:::"****L7LLL&lt;</w:t>
-        <w:br/>
-        <w:t xml:space="preserve">|................................................................-.-----.........-.........-..---............--'....-.---............---..................................-..----..-......-..........................--................--......-...........-.-.---............::::::'''::'""^^^^+^^++**LLI**??*****:::"**&lt;&lt;77LLL*</w:t>
-        <w:br/>
-        <w:t xml:space="preserve">|-.............-''-.........................--'--............-..........-.......-..-......-....................-.......--...-......--.--..-----.-................................-......-----................-............................--.--...........---............-::::::::::''""""""****+^^??LLLLIIILL*****:::"**&lt;&lt;LL****</w:t>
-        <w:br/>
-        <w:t xml:space="preserve">|-'-.--....................--....-......-.....-..-...........-.-''.....--...-...............-'--.--.....................................................-..---.--....-......................................-...-.....-.-...............--...........--.-...--....--..''':::":::::""^^""+*****nn?LL??LLLLIIIL7???**:::"**&lt;&lt;LL****</w:t>
-        <w:br/>
-        <w:t xml:space="preserve">|.....--...................--.--..---.-....---.--.............---......-..--............-......................-.........................----.............-.......-.....-...-................................---......-......-.......--...............--.......--..'''''::""""::"""****++*nnnnnn?11??LLLL?&lt;&lt;77???**:::"**&lt;*??****</w:t>
-        <w:br/>
-        <w:t xml:space="preserve">|-...-'--.........---.-----...........................-.......-.............-....-...--..--..-...-............---..-..----.--..............................---.-...........----...................--.''-.....--...-----......-.------....................--...-''''':::::"^^"":??++***?L7nnnnnnn?11?+**???&lt;&lt;&lt;&lt;???**:::"^^**??*^^^</w:t>
-        <w:br/>
-        <w:t xml:space="preserve">|..........................................................................................................................................................................................................................................................''''':::::"""""^*?+??????nn?L?&lt;&lt;Lnnn*+??++*******&lt;&lt;?**^^:::"^^^^**^^^^</w:t>
-        <w:br/>
-        <w:t xml:space="preserve">|............................................................................................................--.........................-........................................................-........................--...........................''''':::::::":""*****?7?????Lnn???&lt;******+?***************^^^^^^^^^^**""""</w:t>
-        <w:br/>
-        <w:t xml:space="preserve">|.................................................................................................................................................................................................................................................-'''''''::::::::^"^^**&lt;77777?7777Ln**++****^**^*************^^^^^^^^^""^^^^""""</w:t>
-        <w:br/>
-        <w:t xml:space="preserve">|............................................................................................................-........................-........................................................................................................'''''':'''^^^^:"""^^"**++&lt;7???L777??****+***^^^**^*******^^^^**^^^^:''''""^^^.::::</w:t>
-        <w:br/>
-        <w:t xml:space="preserve">|..........................................................................................................................................................................................................................................''''''':''""^^^**^^"""^^^*+LL????+?++???^**^***^^^^**^**^^^^^^^^^^^^^^::''''::....::::</w:t>
+        <w:t xml:space="preserve">|--------------------''..---.........--------------------------------.....-.-----------.........----..-------..-----------------------------------...........-----------------------------------------------.........----..--------------...----------------..-------.............---------------------:::::::::"":::^^^^^^^^&lt;&lt;L?</w:t>
+        <w:br/>
+        <w:t xml:space="preserve">|--------------..------------.........---------------------------..--.....----------.--...........----------------------------------------------..................---------------.-----------------''-----.........-----------------------------------------'-..---..........----------------------:::::::::::::"^::^^^^^****&lt;&lt;L?</w:t>
+        <w:br/>
+        <w:t xml:space="preserve">|-.-----..--------....-------.-........------'---------..------------------------------.................-..-----------------------.-----''..---..........................----------------..-------------........----..---..-------------------------------------.........----------------------::::::::::::::::"^^::??LL****?&lt;&lt;L?</w:t>
+        <w:br/>
+        <w:t xml:space="preserve">|---....------------------------..........------------.--------------------------------.........................----------------..------------.........------...................--------.------------.........-----------------------------..--------------..........-----'----------------:::::::::::::"^^^^::"**????LLhhh??&lt;&lt;L?</w:t>
+        <w:br/>
+        <w:t xml:space="preserve">|--------------------------------........------------------------..---------------.--...........------..................------------------............---..------..--....................----------.........---------------------------------------------.........-..------------------:::::::::::::"""""^^**++***?L7777hhh?hLL7?</w:t>
+        <w:br/>
+        <w:t xml:space="preserve">|---------------------------------........----.--------------.----------..-----------..........----.-------.....................------------..........----------------------..................-..........-------------------------------------------..........-.-------------------:::::::::::::^""""""******++L77LL7777hhhhhLL7L</w:t>
+        <w:br/>
+        <w:t xml:space="preserve">|---------------------------------.........--------------------------..---..-----'-----........------------------------............................----------.--------''-.----....-....................-------------------..---------------------.........----.-------...------::::::"":::::""""^""??*****III??L77LL7777hhhLL77nL</w:t>
+        <w:br/>
+        <w:t xml:space="preserve">|------------------------------'---.........-.------------------------...--------------........-------------------''--------...-..................---.------------------------------------..........----.----------.--------------..----------.........--------------------::::::::"""""":""""***++??*IIIIIII??1nnLL77LL&lt;&lt;&lt;LL77LL</w:t>
+        <w:br/>
+        <w:t xml:space="preserve">|......----..-................-.---.............-.--...-.....-...-.---......---...................-.-........---.................-..-.................--.....-.......-......---...---'-..............--..-.......---...-.---.....-..------.........................---.::::::::::::^^^^"":??++***??77IIIIIIII??1nL????LL&lt;&lt;***LLLL</w:t>
+        <w:br/>
+        <w:t xml:space="preserve">|---......--...-.....-.-..-..-.......................-.................-...-....--'---..........................-................--..........................-......-.-..-..........................-...............-.-.-..-........................-'-...--...-...::::::::::::""^^^^??++???LLLLI??7LLL77III*++?LL???********LL??</w:t>
+        <w:br/>
+        <w:t xml:space="preserve">|..--..........---....---.....-...-----........................-----.....-.-.-...--..............................................................-'-.--.--...-.....-.--........................-.---....................---....-...............................''':::::::::":""""**++??+1LLLLLL7I??LLLL******++?++++*********????</w:t>
+        <w:br/>
+        <w:t xml:space="preserve">|......-..............---............................---.-.-......................-.--.............'--........................---............-......-.-..-........--.............-................-...--.....................................-'-.-----.....'''''':::::""":"":^^****111111L111177I?*??***********++++*********?*?^</w:t>
+        <w:br/>
+        <w:t xml:space="preserve">|....-....................-.-----..--'-.................--....---..................---.....................---...-.-....-........---.......-.-.-.....-.-.......-..-....-.-..................------.................---............................-..-''''''::::::^""""""^""^^^+LL1111L771111?++***??***********++++****^^^^^**?^</w:t>
+        <w:br/>
+        <w:t xml:space="preserve">|..........-......................................................................................-................................................................................................................................................'''''::::::^^^^^"^""""^^^***+L7&lt;LLLL7?+????++****************+++^^^^^^^^^^^^^^</w:t>
+        <w:br/>
+        <w:t xml:space="preserve">|-.....................................--.........................................................................................................................................................................-...............-............'''''::::::^^^^^***^^^""""^^^+++7L7&lt;??++??+?***^^*************^^^^^^^^^^""""""^^^^</w:t>
       </w:r>
       <w:r>
         <w:rPr>
@@ -243,19 +237,15 @@
           <w:szCs w:val="4"/>
         </w:rPr>
         <w:br/>
-        <w:t xml:space="preserve">|.............................................................................................-.......................................................................................-................................................'''''''::"""""^**^****^^""^^^*+L?**??+?*****^**^**^^^^^^^"^^^^^:"":::^^^^.::''''::..::::::</w:t>
-        <w:br/>
-        <w:t xml:space="preserve">|--.......................................................-.........................................................................................................................................................................'''''''':^"""**^*^???+?**^^""^^"*???*^*********^**^*^"""^^^^"""""::"":::.....::'^^^:::::::::"</w:t>
-        <w:br/>
-        <w:t xml:space="preserve">|'''----------...........................................................-.....................................................................-....................-...........................................................'''''''':":::**^^*?????LL??+**^""^^"****^^********^^^^"^^""'::::""""':::::::..:::::^^^^::^^^^""""</w:t>
-        <w:br/>
-        <w:t xml:space="preserve">|::::::::'''--------------'-----............................................................................................................................................................................................'''''''':::::^^^**???L?LLLLLL+??**^""^^"****^^****^^^^^^^::::::'::''''''':::::::::::::::::"""^^^^""^^</w:t>
-        <w:br/>
-        <w:t xml:space="preserve">|^^"""""::'''''''''':::::::::::-''''''''''''''''-...............---.....................................................................................................................................................''''''''::::"^^^^++?+?LLLLLL*?***+****^"""""^^*^""^^^*^:""""::::'::'''''''''':::::::^^^^^:::::""^^^**^^^^</w:t>
-        <w:br/>
-        <w:t xml:space="preserve">|""""""":::'''''''':::""""""":::::::::::'::'::::''------.-..--'''''................::'..'-::":'.'.:.................................................................................................................''''''''::::":::"^++++*??LL**?****^^^^*^^^""""":^"^^":""""::""::'':''::''''''''''::"":::^^^^^^^:::"^^^^**????</w:t>
-        <w:br/>
-        <w:t xml:space="preserve">|:::::""":::''''''::""""""""""""""":::^:::::::::':''''''''''':::::'................:^^'''.':"^:.'.'..''-'.......................................................................................................''''''''":::^^^^^":"^*****^^****^*^^^*^^^^*^^"":""":::::':""''''':::'':'''''''::"""""::""^^^**^^^^^:::"^^****????</w:t>
+        <w:t xml:space="preserve">|---.-------...-..........................................................................................................................................................................................................................-''''''':::"^^"^^********^^^"""^^^+++?**+??+********^^*******^^^^^^^^^^"^^"""""""":....</w:t>
+        <w:br/>
+        <w:t xml:space="preserve">|'''''''''''...--...-......................................................................................................................................................................................................-...........'''''::'''^^"""^*^***?????**^^^"""^""+LL?*^************^^**^^^^^^^^^::"""""^^"":::::::....</w:t>
+        <w:br/>
+        <w:t xml:space="preserve">|:::"""""'''''''''''''''''.........-..-..-.......................................................-.................................................................................................................................'''''':'::::::^******??????L??+*^^^"""^""****^^************^^^^^^^^:::::::"""'''':::::::::::::</w:t>
+        <w:br/>
+        <w:t xml:space="preserve">|^^^^""""::::::::::::::''':''::-------'-.-----''---....-.............".................................................................-.......................................................................................'''''''''':::":^****???L??LLLLLL???+**^"""^""**^*^^*******^^^**^^:::""::::::::''''''':::::::::::::</w:t>
+        <w:br/>
+        <w:t xml:space="preserve">|^^^^^^^^^^^^^^^^^^^::::::"::''''''''''--''''''''''-''.-.............""'..''':"''-.-....................................-..................................................................................................''''''''':::::^^**^^++?&lt;??L7LLLL?++*???+**^""""""^^^*^^^**^^**^"""""":::":::::::::'''''''::::::"""^^^^</w:t>
       </w:r>
       <w:r>
         <w:rPr>
@@ -268,109 +258,9 @@
           <w:szCs w:val="4"/>
         </w:rPr>
         <w:br/>
-        <w:t xml:space="preserve">|:'::::::"":''--'':"::::::""""""^^^^^^^^^^^^^^^:"'''''''''::::"^^^^''''''::':':::-::"^^"-..'':"'..''.-'-'.::::''.............-'''-'.:.......................................................................'''''''":":^^^^^+++^^":"^*^^^^^^^^^^^*^^^*^""^^^^":'"""'::::''::''''''':'':':::'::::""^^^""^^^^^*****^^:::"^^***&lt;???L</w:t>
-        <w:br/>
-        <w:t xml:space="preserve">|:'''''''::'------':'''''::::::::::::::::::::::^:''''''''''':^:"::::''''":::"""":':':"^^'-..':^^..'-..'-'.-..'''''.'''''-............-'.-:.:':''........................................................''''''':^^"^^^^+********^:::^*^^^^^^^^^^^*"""^^":::":::'"""'''::'''''''''"":''::::::""""^^^^^""**********^^:::"****&lt;&lt;???L</w:t>
-        <w:br/>
-        <w:t xml:space="preserve">|:''''''''''------''''''''''''''''''::'::::'::::":'::''''''':"::''':::::"::'::""::::::^^-"-..'"::.--'..-'.'.'''-''.'-'-'':'-::''............-.--'.''':'.'-.-.'-...':''...............................'''':'::':"^*^***+??***^^^*^:::^^^^^^^^"""""^"::"::::':''''""^:''''''"""^"":"":""""^"":"""*^***********??*****:::"***&lt;??LLLL</w:t>
-        <w:br/>
-        <w:t xml:space="preserve">|'''''''''''------'''''''''''''''''''''':'''::'''''::''''-'':''''''''''::::':':::':::::^-^"-..''"'..-' -'....''-'-.-----'''-'''''''-''''............'''.'-.-.'. .'.''-'.-..'::':'''':............''''''::::":":^***????^^^^^^^^^^:::""^:":""":::::::':''''''''':"^^::::::""""*^^"^^"""""+??*****^****nn++?++??*****:::"**&lt;&lt;??LLLL</w:t>
-        <w:br/>
-        <w:t xml:space="preserve">|--.-.........--...'''''''''''''''''''-''''-:'''''''''-'.-'''''''''''''-'''''''''''':::^-^^:'.'''^'.-'..'..'.''-'-.-----''-.'''-----''''''.:':'..........-.-...--...-....-:"^:':''.'...'.''":'''''':::^^^^*^:":^**^*^^^^^^"^^^^""::::::':'''::'''''''''''''''::":^^"::^^^"^^^*^^*++****++??*LLLL?++**nn++L??**???**:::"**??LL????</w:t>
-        <w:br/>
-        <w:t xml:space="preserve">|.............--.........-........-....-...-''''-'''''.-.-'''''''''''''-'''''''''''':::^-:^":'...:^'.''.'....'----.-----''-.'''---..'-'''...-'-''.'''''..-....--.......-:'"::'-'.....'.'::^^^':'::"^^^**+**^:":^**^*^^^^^^"^"::::':''''''''''''''''''':::::::::""^^"^"^^^*++++++*++*nn???nnnLLLL?++++nn??L??**?****:::"**??LL???*</w:t>
-        <w:br/>
-        <w:t xml:space="preserve">|.............--............................-..........-...........'.--'...'.......':::"-::"::'..'"'......-..'--'-..----''-.'''---..--''.....'--'.-''''......---....'-::"'':''.....'''::^^^^^''^"**??**+*^^*:":^*^^*^^:::":":''''':''''''''''''':::::::::"^^^""""^^"^^****++7777LLLLnn??1nnnnn&lt;&lt;?++++n*+++++&lt;&lt;*****:::^**????****</w:t>
-        <w:br/>
-        <w:t xml:space="preserve">|---.---......''.......................................-...........................':::"-:::"^:'..::-..-......-.--..----''-.'''---..'--'.....'---.--'''....-.---....'-::'-'--......::':"^:^::''^?*+?^^^^^^"^:::"^^"^:"'''''''''''':''''''::::::::""""""":"+*^^"""^^"**???L77777LLLL7nn?71nnn****+******+++++*******^^^^**????****</w:t>
-        <w:br/>
-        <w:t xml:space="preserve">|'''-''-....--''--....---.----.........................-'..........................':::"-::::""''..'-'.-'...........----''-.''----..'--'.....'---.--'''...--.-...''"'-'''.....--':^::'::::::'''^*^^""""^^^":':':::':':''''-'''''''::''::':""""""""^^^*****+**^^":^^^**?LL777LLLLLLL?***?????****+**^^**************^^^^**********</w:t>
-        <w:br/>
-        <w:t xml:space="preserve">|::'-'''------''------'''-'''''''''''.................-.'-....--...................':::"-'::':^^-'...:'.''...................-----..'--'.....'---.---''.'......'':"''-'...-.':':^^^::.':::::'''^""^"""""^^:'':'':-':''''''-''::'':::::":::"^****^*^^LLLL?*++*^^":^^^*?LLL7++????????***?****^^**^**^^**************^^^^**********</w:t>
-        <w:br/>
-        <w:t xml:space="preserve">|::::::::'''------'':::::::''':::::'''''''''''--'''---'-'-''-''''''................':::"-:::':::":'..'".'....'----..--........................---.---''......'':'''......-':^:-:"''::':'::::'''^:::::'::::''':''--'-''''''::::":::::"^^^^^^^?LLLLLLLLLLLL??+**^":^^^+?+++?++????+*****^*****^^**^**^^^^**********^^:::"^^********</w:t>
-        <w:br/>
-        <w:t xml:space="preserve">|^^""""":::'''--''':::""""""""""^:::::'':::'::::'''''''-'-''''::''''.......-.......':::"-:::'::'-"^--'''.......--....-'--'-.-'----....... . ........-''....-.:'''......-:'"^::-:''':'':'::::''':'':'.''-.--''":'::':':::::""^^^^":::^^**+++??LLLLLLLLLL***+?+*^":^^^*****?**+???+*****^*****^^**^**^^^^**********^^:::"^^********</w:t>
-        <w:br/>
-        <w:t xml:space="preserve">|"""""""":::''--''::""""""""""""^^^^^^^^^^^^^^::'''''''.''''::::^^^'':':'::':':'-':':::"-'::'::'''::-..''...........---.-'---'.'-.-.---'.''..'.............:.'--......::"':'''-'''':'.''::::'''.''-..''-::'':"::"":"^^^^^^^^+**^^":"^*+++**++L******??*****++*^::^^^*****?^^*+++******^*******^^^^^^^^^**********^^:::"^^********</w:t>
-        <w:br/>
-        <w:t xml:space="preserve">|"::::::::::''--''::::::::::""""^^^^^^^^^^^^^^^^:''::'-.'''':^^^^^::::::":::"":::':'::::-'::'::'''':.-..'......................'--...-.........---.'-'-.''''......:::.:':'''''-''''''.''':::'''..':'.'':^::::":"^*^*?????***+++*^":"^*^*^^******^^^^**^^^^*++^^::^^^*^***?^^**********^*******^^^^^^^^^**********^^:::"^^********</w:t>
-        <w:br/>
-        <w:t xml:space="preserve">|:::::::'::'''''''':''::::::::::::''::':::::::::':'::'-.'''':'':::":::::"'':"""::':'::::.'::':''''''.:....:::::'''..'-''-......................-..-----.'-.....'''::'.''''''''-''''''.''':::''':::::'^^^^^^"^":^**???????***^*^*^":"^*^^^^^*^^^^^^^^**^^^^***^^::^^^^^***+^^**********^*******^^^^^^^^^**********^^:::"^^********</w:t>
-        <w:br/>
-        <w:t xml:space="preserve">|::''::'''''''''''''''::::::::::'''''''':'''':'''''::'-.''::::'"::'''''':::':::::':'::::-'::'':'''''-'"...'''.'--'.--''''''-::''''-.''''.'...................:':''-''.''''''''-''''''.''':::'''^^^^^?***++**^":^**?*^^^*^^^^^^^^^":"^^^^^^^*^^^^^^^^**^^^^^*^^"":^^^^^****^^**********^*******^^^^^^^^^**********^^:::"^^********</w:t>
-        <w:br/>
-        <w:t xml:space="preserve">|::''::''''''''''''''''::''::::'''''''''''':''''''''''-.'''''::''''''''''--'''''-'-'::::-'::''''-'''-'''...............--...'''''--.'-''::.:':'''.'''''....'.:'''''''.''''''''-''''''.''':::'''^^?^*?*+**^^*^":^**^*^^^^^^^^^^^^^":"^^^^^^^^^^^^^^^^**^^^^^*^^"":^^^^^***+^^**********^*******^^^^^^^^^**********^^:::"^^********</w:t>
-        <w:br/>
-        <w:t xml:space="preserve">|::''''''''''''''''''''::'''':''''''''''''':''''''''''-.'''''':''''''''''--'''''''''::::.'::''''-'''-''-:.''.............................'....---.-''''.'''-.''''''''.''''''''-''''''.'''::''''^^^^^^^***^^^^":^*^^^^^^""^^^^^^^":::"^^^^^^^^^^^^^^^*^^^^^^*^^"::^^^^^***+^^******************^^^^^^^^^**********^^:::"^^********</w:t>
-        <w:br/>
-        <w:t xml:space="preserve">|::'''''''''''''''''''''''''':'''''''''''::'''''''''''-.''''''::'''''''''--''''''.''::::.':'''''-'''-''-'.-':':'''.'''''::'-''''''......................'-.-.''''''''.''''''''.''''''.'''::''''^^"^"""^^^^^"^":^^^^^^^"""^^^^^^^":::"^^^^^^^^^^^^^^^*^^^^^^*^^"::^^^^^***+^^******************^^^^^^^^^**********^^:::"^^********</w:t>
-        <w:br/>
-        <w:t xml:space="preserve">|::''::''''''''''''''''::'''':'''''''''''::'''''''''''-.'''''''''''''''''--''''''.''::::-':'''''-'''.''-'.'.'''-''.-----'''-'''''''-'':::'.'':'''.'''''.'-.-.'-''''''.''''''''-''''''.'''':''''^^"^"""^^^^^":":"^^^^^""^"^^^^^^^":::"^^^^^^^^^^^^^^^^^^^^^^*^^"::^^^^^***+^^******************^^^^^^^^^**********^^:::"^^********</w:t>
-        <w:br/>
-        <w:t xml:space="preserve">|::''::''''''''''''''''::'''''''''''''''''''''''''''''-.'''''''''''''''''--''''''-''::::-':'''''-'''.''-'....''-'-..----''-.'''---..'-'''...-'--'.-''''.'-.-.'-'-''''.''''''''-''''''.'''':''''^"":"""^^^^^":":"^^^^^""^"^^^^^^"":::""^^^^^^^^^^^^^^^^^^^^^*^^"::^^^^^***+^^***************^**^^^^^^^^^**********^^:::"^^********</w:t>
-        <w:br/>
-        <w:t xml:space="preserve">|:''''''''''''''''''''''''''''''''''''''''''''''''''''-.''''''''''''''''''''''''...:::::-'''''''-'''.''-'....''-'-..----''-.'''---..'-''.....'--'.--'''.'-.-.'-'-..''.''''''''-''''''.'''':''''^"":"""^^^^^::":"^^^^^""^"^^^^^^"":::""^^^^^^^^^^^^^^^^^^^^^^^^"::^^^^^****^^***************^**^^^^^^^^^**********^^:::"^^********</w:t>
-        <w:br/>
-        <w:t xml:space="preserve">|:''''''''''''''''''''''''''''''''''''''''''''''''''''..''''''':''''''''''''''''...'::::-'':''''-'''.''-'..'.'--'-..----''-.'''---..--''.....'---.--'''.'-.-.'-'-..''.''''''''-''''''.'''':''''^"":""^^^^"^::":"^^^^^""^"^^^^^^"":::""^^^^^^^^^^^^^^^^^^^^^*^^"::^^^^^****^^*******^*******^**^^^^^^^^^**********^^^^^^^^*******^</w:t>
-        <w:br/>
-        <w:t xml:space="preserve">|:''''''''''''--''''''''''''''''''''''''''''''''''''''-.''''''':''''''''''''''''...'::::.'::''''-'''.''-'..'.''-'-..----''-.'''---..--''.....'---.--'''..-.-.'-'-..''.''''''''-''''''''''':''.'^"":""^^^^"^::"'"^^^^^""""^^^^^^"":::""^^^^^^^^^^^^^^^^^^^^^*^^"::^^^^^****^^*******^*******^**^^^^^""^^**^*******^^^^^^^^*******^</w:t>
-        <w:br/>
-        <w:t xml:space="preserve">|:''''''''''''--''''''''''''''''''''''''''''''''''''''..''''''':'''''''-''''''''...'::::.'':''''-'''.'--'....'----..----''-.''----..--.-.....'---.--'''..-.-.'-'-..''.''''''''-''''''.'''':''.'^"":""^^^^"^::":"^^^^^""^"^^^^^^"":::""^^^^^^^^^^^^^^^^^^^^^*^^":'^^^^^****^^*******^*******^**^^^^^^^^^**^*******^^:::"^^*******^</w:t>
-        <w:br/>
-        <w:t xml:space="preserve">|'''''''''''''..''''''''''''''''''''''''''''''''''''''-.''''''':'''''''-''''''''-..'::::.'''''''-'''.'--'....'----..----''-.''----..---......'---.---''..-.-.'-'-..'-.''''''''.''''''.'''''''.'^"":""^^^^"^::"'"^^"^^""^"^"^"^^"":':""^^""^^^^^^^^^^^^^^^^^^^^":'^^^^^****^^*******^***^***^**^^^^^^^^^**^*******^^:::"^^*******^</w:t>
-        <w:br/>
-        <w:t xml:space="preserve">|'''''''''''''..''''''''''''''''''''''''''''''''''''''...''''''''''''''-'''-''''-..'::::.'''''''-'''.'--'....'----..----''-.''----..'--......'---.---''..-.-.'-'-'''-.''''''''-''''''.'''''''.'^"":""^^^^"^::":"^^"^^""""^^""^^"":':""^^""^^^^^^^^^^^^^^^^^^^^":'::^^^***^^^^*^^*^^^^^^^***^**^^^^^^^""^^^^^**^^^^^:::"^^^^**^^^^</w:t>
-        <w:br/>
-        <w:t xml:space="preserve">|:''''''''''''..''''''''''''''''''''''''''''''''''''''...'''''''''''-'---''-''''-..'::::.'':''''-'''.'--'.-..'--'-..----''-.'''---..'--......'---.---''..-.-.'-'---'-.''''''''.''''''.'''''''.'::::"""^^^:^:::':^^"^"""""""^"^^"":':""^^"^^^^^^^^^^^^^^^^^^^^"":'::^^^***^^^^*^^*^^^^^^^***^**^^^^^^^""^^^^^**^^^^^:::"^^^^**^^^^</w:t>
-        <w:br/>
-        <w:t xml:space="preserve">|:''''''''''''..''''''''''''''''''''''''''''''''''''''...'''''''''''-----''-''''-..'::::.:''''''-'''.'--'.-...-.--..----''..''----..'.-.......---.---''..-.-.'-'---'-.''''''''.''''''.'''''''.':"::"""^^^:^:::':^^"^"""""^"^"^^"":':""^^"^^^^^^^^^^^^^^^^^^^^"":'::^^^***^^^^*^^*^^^^^^^***^**^^^^^^^""^^^^^**^^^^^:::"^^^^**^^^^</w:t>
-        <w:br/>
-        <w:t xml:space="preserve">|:''''''''''''..''''''''''''''''''''''''''''''''''''''...'''''''''''-----''-''''-..'::::.:''''''-'''.'.......................................................'.'-'''-.'''-''''.''''''.'''''''.':"::"":^^^:^:::::^^"^"""""^"^"^^"":':""^^"^^^^^^^^^^^^^^^^^^^^"":'::^^^***^^^^*^^^^^^^^^^***^**^^^^^^^""^^^^^**^^^^^:::"^^^^**^^^^</w:t>
-        <w:br/>
-        <w:t xml:space="preserve">|:''''''''''''..''''''''''''''''''''''''''''''''''''''-..'''''''''''-'---''-''''-..'::::.:'''''''''.....................................................................'.''''.-'''''.'''''''.':"::"":^:^"^:::':^^"^"""""""^"^^"":':""^^"^^^^^^^^^^^^^^^^^^^^"":'::^^^^^*^^^^*^^^^^^^^^^***^**^^^^^^^""^^^^^**^^^^^:::"^^^^**^^^^</w:t>
-        <w:br/>
-        <w:t xml:space="preserve">|:''''''''''''..''''''''''''''''''''''''''''''''''''''...'''''''''''-'---''-''''-..'::::.'''''...................-.---------------------..'..'-----'---............  ..................''''''.-:^::"":^:^"^:::':^^"^"""""^"^^^^"":':""^^^^^^^^^^^^^^^^^^^^^^^"":'::^^^^^*^^^^*^^^^^^^^^^***^**^^^^^^^""^^^^^**^^^^^:::"^^^^**^^^^</w:t>
-        <w:br/>
-        <w:t xml:space="preserve">|:''''''''''''..''''''''''''''''''''''''''''''''''''''...'''''''''''-'---''-''''-...:'-'.-'.............'......---.--'-.-.---'.-'-..--.........-..-'---..-----..-................. .........-..:^::"":^:^:^:::':^^^^"""""""^^^^"":':""^^^^^^^^^^^^^^^^^^^^^^^"":'::^^^^^*^^^^*^^^^^^^^^^***^**^^^^^^^^^^^^^^**^^^^^:::"^^^^**^^^^</w:t>
-        <w:br/>
-        <w:t xml:space="preserve">|:''''''''''''..''''''''''''''''''''''''''''''''''''''...'''''''''''-'---''-''''-...'''...-........-'''-.......--...-'-.-.-.-'-.'-.............-..--.-.......'-'--':'----............... ......:^:::":^:^:^:::':^^^^"""""""^"^^"":':""^^"^^^^^^^^^^^^^^^^^^^^"":'::^^^^^*^^^^*^^^^^^^^^^***^**^^^^^^^^^^^^^^**^^^^^:::"^^^^**^^^^</w:t>
-        <w:br/>
-        <w:t xml:space="preserve">|:''''''''''''..''''''''''''''''''''''''''''''''''''''...''''''''''--'---''-'''.-...............''''-'.-........-...-'..-..........................-.........'--...:'''''''''''................:::::":":":^:::':^^^^"""""""^"^^"":':""^^"^^^^^^^^^^^^^^^^^^^^"":'::^^^^^*^^^^*^^^^^^^^^^***^**^^^^^^^^^^^^****^^^^^:::"^^^^**^^^^</w:t>
-        <w:br/>
-        <w:t xml:space="preserve">|:''''''''''--..--''''''''''''''''''''''''''''''''''''...''''''''''-.'---''-'''............-..'-'-''-'.-...............-......-'-'..'':::'.:':'''.'''''......'--....'''''''''''''''''''...--...':::':::::::::-':^^"^"""""""""^^"::'::"^^"^^^^^^^^^^^^^^^^^^^^"":'::^^^^^*^^^^*^^^^^^^^^^***^**^^^^^^^^^^^^****^^^^^:::"^^^^*****^</w:t>
-        <w:br/>
-        <w:t xml:space="preserve">|:''''''''''--..--'''''''''''''''''''''''''''''''''''-...''''''''''......--.............--.''':''.''-'....'':':'''.'''::::'-''''''-.'-'.-'..-.-..............'......'-'-'''''''''::'':''::''''-''.'..':':':'--''"":":::""":""^^"::'::"^^"^^^^^^^^^^^^^^^^^^^^"":'::^^^^^*^^^^*^^^^^^^^^^***^**^^^^^^^^^^^^****^^^^^:::"^^^^*****^</w:t>
-        <w:br/>
-        <w:t xml:space="preserve">|'''''''''-........-'''''-''''''''''''-''''''''''''.........-'''--'...................'-'':''''''.''.'..:.:''''--'.--''''....-.......................--.''.-........--'''''''''''-''''':":::':'..........-.'..---::"''':':':::::'''''::::^^^^^^^^^^^^^^^^^^^^"":'::^^^^^*^^^^^^^^^^^^^^^***^**^^^^^^^^^^^^****^^^^^:::"^^^^*****^</w:t>
-        <w:br/>
-        <w:t xml:space="preserve">|'''-''''--...............---..-...-..-..'''.-.....................................'.::::::''':''.''...''.............................''''..  .......  .'-':.:--....--'''''''''''''''''':'''''':::'.'-........--..':'''''''''''''''''''':"""""""":""""^^^^^^^"":'::^^^^^*^^^^^^^^^^^^^^^*^^^**^^^^^^^^^^^^****^^^^^:::"^^^^*****^</w:t>
-        <w:br/>
-        <w:t xml:space="preserve">|-'-............................................................... ........      .'::::':'''''''.'..'"-.............'''''   .   ... ..  .   ...  ....   ..'.:':''......'-''''''''''''''':'''''""::^:''''''-.-'''''..-----..''''''-'''''':::::::::::""""""^^^::'''':^^^^*^^^^^^^^^^^^^^^*^^^**^^^^^^^^^^^^****^^^^^:::"^^^^*****^</w:t>
-        <w:br/>
-        <w:t xml:space="preserve">|.-................................................................................::^"'':''''''....-:'..----... .       . .  ......... .........     . .....'-''"::'.....--'''''''''''.''''''':^:"**::::::"''''''''''''''''...-------''''''''':':::"":::::::''''''::"^^^"""^^^^"^^^^^^^^^^^**^^^^^^^""^^^****^^^^^:::"^^^^*****^</w:t>
-        <w:br/>
-        <w:t xml:space="preserve">|..................................................................................::":'':'''':'...:-'..' ...          ..   . .....--'-... .          . .......-''::'-:''-...'.-'''.''..'''''''::::"^:^^^^^^^^^^^^^^''':''':'''''''''-......-'--':''::':''''''''''''::::::::^^^^"^^^^^"^^^^^""^^^^^^^""^^^^^**^^^^^:::"^^^^*****^</w:t>
-        <w:br/>
-        <w:t xml:space="preserve">|..................................-...............................-.-------::-''..:'':'':'''''-.'':.'.:......... .............  ..........      ......     .-.....''-::"':-'.......'''.''''''':::::":^:^:^:""^^^^^^^^^^^^^^''''''''''''''''''---.-...--..'''''''--''''::::::::::""""":"^^^^""""^^^^^""^^^^^**^^^^^:::"^^^^**^^^^</w:t>
-        <w:br/>
-        <w:t xml:space="preserve">|---......................---....''''''::''''''''''-----------'''''''''''''-:::::'.:'':'':''''.-.::'.............        ....   .. .............. ..          ''.....-'':'""::---.......''''''':::::::":^:^:""""^^"^^^^^^^""^^::::::'''''::':''''''''''-..---'-''---''''''''''''''"""":"":::""::""""^""^^^^^^^^^^::''''""^^**^^^^</w:t>
-        <w:br/>
-        <w:t xml:space="preserve">|:''''''''''''--'''''''''''''''''''''''':'''''''''''''''-''''::''':'-'---''-::''...:'':'':''-..'"^:'.-. .................           ..  .......... ..    '......'......-'-':^^''''......''''''':::::::":^:^:"":"^^"^"^"^"^""^^"""::::::^^^^^:':::::':''''''''''''----'...---..'''''''''''''''"::"""""::"":""::::^::''''""^^^^^^^^</w:t>
-        <w:br/>
-        <w:t xml:space="preserve">|:'''''''''''''''''''''''''''''-''''''''''''''---''''''''-''''''''''-'-----.''.....:'':'':'-.-:^:''.- . ..  ...........    .''  ....  .     ..                   . ......-''::'::^^::-'-...'-.':::::::":^:":""::^^"^^""^"^""^^^"""":"""^^^^^^^^^^^**:'''''''::''''''''''''--..--'''---'-'''''''''::::'':":"":::::::''''::"""^^^^^</w:t>
-        <w:br/>
-        <w:t xml:space="preserve">|''''''''''''''''''''''''''''''-''''''''''''''---'-''''''---''''''''-'-----........:'':''-..-:"''...  . ...........           ...    .. .......--''........          .-.....''-:'::":-::''.'...::'::::":^:":""::^^"^^""^:^""^^""""""""^^^"^^^^^^^^**^^^^^^**:::::::::::'''''-''''-----'--.........:::''::::::::::::''''::""""""":</w:t>
-        <w:br/>
-        <w:t xml:space="preserve">|''''''''''''''''''''''''''''''-''''''''''''''---'-''''''---'''''''--'.-.--........:'':''.-':^^'..':..... .................. .       ........ ..   -.....   .-'''''''' :'-.....'''':"-^^^:"''.-:::::'':'":"::"::^^"^^""^:^""^^"""":""""^^"^^^^^^^^^*^^^^^^***^^^^^^^::::::::::'''--''''"":::.......--''.....:::::::'''':::::::"":</w:t>
-        <w:br/>
-        <w:t xml:space="preserve">|''''''''''''''''''''''''''''''-''''''''''''''---'-''''''-'''-''''''-'.-.--........:''''.-':":"'..' ........-'----..... .................. .........---....... ..........-'......''::-:""^^^:'':"::::::::':'::::"^"^^""^"^""^^":"":""""^^"^^^"^^^^^^^^^^^^*^^****^^^^^^^""""::'':::::::^":::''''"''::''.......:::..''''::::::::::</w:t>
-        <w:br/>
-        <w:t xml:space="preserve">|''''''''''''''''''''''''''''''-''''''''''''''--'--''''''-'''--'''''-'.-.--........'.'.--'^"":'..:    .. .  ..............  ..   -'............  .   .. ..  ..             :'--....':-::::^^:''^"^"":"::"----:'''':":::^"^":^^"::":"":"^^"^^^""^^^^^^^^^^^^^^^^**^^**^***""""""""""":::^^^^^^^^^"''::''::::::::::..''''..::-----:</w:t>
-        <w:br/>
-        <w:t xml:space="preserve">|''''''''''''''''''''''''''''''-'''''''''''''''''-'''-''''--''-''''--..-...........'.--''^^::'..'...  .................        . .......... ...  ........--.......... .. .   :'-....'.':'::"^':^^**^^^"^^::'':''::'''''"::::^^":"":"::"^^"^^^""^^^^^^^^^^^^^^^^^^^^^^^**********"""""""^^***^^^^^^^^^""^^::::::::::'''':.::-----.</w:t>
-        <w:br/>
-        <w:t xml:space="preserve">|''''''''''''''''''''''''''''''-'''''''''''''-'''''-----.'---'-----................'-.':'^":'-.'..........   . .. ..   .          .       .   ........----.-...................''.......'':::':^**+??**^^^^::"''":':''':''':::::::::":"^^""^^""^^^^^^^^^^^^^^^^^^^^^^^^^^^^^***********^^***^^**^^^^^""^^^^^^^^^^^:''''::::::::::</w:t>
+        <w:t xml:space="preserve">|^^^^^^^^^^^^^^^^^^^^^^^^^""":::''''''''':::::::""""'''''''-...''.--.^^"':..-::'^'.''''.''....':..............................................-........................................................................''''''''':::::"^^*^?????+?L7LLL?*++??**^***+*^"""""""^""^"^^*""""":"""::::::::::::::::''''''^"""""""""^^^^</w:t>
+        <w:br/>
+        <w:t xml:space="preserve">|":::""""::::^^^^^^^^^^^^^^"":::''''''':::""^^^^^^"""""::::'::::::--."^^""'..-:'^:--'''..'...'...'.'-'''.-'''......................................................................................................''''''''':::::^""""^**??+++???*****?*******^**^^^^":"""""^":":::""""''''':::::::::::::::::^^^^^^^"""""^^^^***^</w:t>
       </w:r>
       <w:r>
         <w:rPr>
@@ -383,7 +273,7 @@
           <w:szCs w:val="4"/>
         </w:rPr>
         <w:br/>
-        <w:t xml:space="preserve">|''''''''''''''''''''''------------'-------''-.......................................:"^'":'-.'.... ....  ..........-.-......... ....     ... .........  ..................    .' </w:t>
+        <w:t xml:space="preserve">|:::::::::::::^::"""^"""":"^^::::''''''"""^^^"^^^^^^^^^^^"":^^^^^:--:"^^^^:'..'':^'-.'''.'...'...........-''''::'-''...........................................................................................'''''''''""::^^^^^^^""^^*?+++^*^^**^^^*+**^***^^*^^^""":"""::"::":''::''''''''':::::::::::::::^^^^^^^^^^^^^^^^**??</w:t>
       </w:r>
       <w:r>
         <w:rPr>
@@ -395,11 +285,104 @@
           <w:sz w:val="4"/>
           <w:szCs w:val="4"/>
         </w:rPr>
-        <w:t xml:space="preserve">:''-.....''''^""^^^**+++*":"::^^":'''''''':'''':':::"^^":"^""^^^^^^^^"^^^^^"""^^^^^^^^^^^^**^^^^^^***^*&lt;&lt;&lt;???*^^^^^""^^^**^^^^^^^^^^^^^^:::::::</w:t>
-        <w:br/>
-        <w:t xml:space="preserve">|-------------..-------------......-...............................'................:"^^':'-.-:.....  ......-'''''''''''-... ...     ...............  .........''---.... ...  ......:-''...'-'':""^""^^^***^:"::^*^":":''''''''''''''':::::"^""^^^^^^^^"^^^^^"""^^^^^"^^^^^^**^^^^^^^^^^^**&lt;????&lt;^^""""^^^*******^^*^^^^^^^^^^^^^</w:t>
-        <w:br/>
-        <w:t xml:space="preserve">|----....................-.......................'.....-.-..------'-.--'.'''..''.'.'^*^</w:t>
+        <w:br/>
+        <w:t xml:space="preserve">|:::::::::::::":::::":::::"^^""::''''''""^"":"^^^^^^^^^^^""":::^^"::""""^*^'-..':^''.'''.....'.''.............'''.'':'''-..-...............................................................................''''''''":"":^^^^^+++*^^""^^+*^**^^^^^^^^^^*^*^*^^^"^^^":::'""":'':::''':''''''''''::::::::::::^^^^^^^^^^^^^^?????**??</w:t>
+        <w:br/>
+        <w:t xml:space="preserve">|:::::::::::::":::::"::::::"""":''''''':::""::"""""""""::::':::^^"^^""":"^^''-.''":^'.'''....''-'::''''-.............''''.'''::''................---....................................................'''''''^^""^^^^^++*++***+*^::"^+^^^^^^^^^^^^^"^^""^^:::::""::''"""''':''''''''''^"::"":::::^^^^::^^^^^^^++**??**?????*&lt;L?</w:t>
+        <w:br/>
+        <w:t xml:space="preserve">|''''''''''''':'''::"::::::'''''''''''''::::'::::::::::::::'::::::'':""::^^:^'-'-:'":..''-...'.'.''.''''.-'''''............--'.':.:':-'..........---'''.'....-.-'...................................''':'''::::^*^^+++????++*^^^^*^:::^*^^^^^^^"""^"""^:::"":::'':'''''""^::'''''""""""^^"::^^""^^^^^^^:********++**????LLL??&lt;&lt;L?</w:t>
+        <w:br/>
+        <w:t xml:space="preserve">|-...---------:''''':''''':''''''--'''''''::'::::::::::::::''''''''''""::^":*^''..-:^'.-''...'...''.----.-'''''''-'::''............-'.''.''''....-.-'''.. ..:'.-''-...''''"^:'..................''''''':::::::"^***?????^^^^^^^^^^^:::^^^^"^"^""":::::::''::'''''''''':""^"""::""""""^^**^""^^""*++??&lt;&lt;*******????**hh??LLL?????L</w:t>
+        <w:br/>
+        <w:t xml:space="preserve">|........-----.-----'-----.''..----'''-''''''''''::':''::::''''''''''""::"":"^^'-.-':''.''-..'.....-----.-'-''''--''''''-.''::...........-''''-'.-.-''....'.'-.'-...-:::'':::''........--''.''''''::::**^^^"::^^*??+*^+^^^^^^^^^^"":::""""":::''::''''''''''''''''':::"::^"""""^^^^^^^^**+++++++*++??&lt;III7777?????**hhLLLLLLL???L</w:t>
+        <w:br/>
+        <w:t xml:space="preserve">|..............................--..'''...-...-''.''.:'''''''...''.'''""::""::"^''..-:'"-.'-..'.....-----.-'-''''-.''''''-.''':':'.:-:............-.-....-'...'....-':"^:'-'''......'''""^:-''':'':^^^*???^^"::^**^^*^^*^^^^^^^^::::::':::'::''''''''''''''''::::::":::"""^""^""^^++++++++++++777I????IIII77LL???????hhLLLLLL?LLL?</w:t>
+        <w:br/>
+        <w:t xml:space="preserve">|..................................'''...........''..''..............""::""'::"'^"'..':'..-'.'.....'----.----'''-.''''''-.''-.'.'.'-''''.'''.....-....'''.......':"'"::''-......'''::^^^^:-''"*^^??**?+**?+:::^*^^^*^^*^^:::"":''''::''''''''''''''''':::::::::^^^^""""""^""^^^+*++++11111777777I??11IIIIIILL?????**?????????LLL?</w:t>
+        <w:br/>
+        <w:t xml:space="preserve">|'''----------.-----.............--'''-.............................."":"""':::'^^'-..'':......-...-----.----'''-.'-'-''-.-'--'.....'--'.-''''-'.....''-'....'.':""-''''.......'':^"^^^^^:-'^^***?**+***^^^:::"^^^^^:"^:"'''':'''''::'''''''''':::::::::""^^"""^^^^^^""""^""^**??L71111111777711ILL11IIII****++*++**??????***????</w:t>
+        <w:br/>
+        <w:t xml:space="preserve">|''''''''''''''-----.-----.....--''-'''..-..........................."":"""':::':^':...'"-.........-----.-'--'''-.-''-''-.----'.....'---.--'''.'...-'''-'....'.:::'-'--...-.''::':^"::""":-'^?**^^^^^^^^^^"::::"^:":'::':''''''''''"":''::::::::""""""^"""++***++*^^^^"::^^^***??11117777777771?*++??????****++*++***********????</w:t>
+        <w:br/>
+        <w:t xml:space="preserve">|::::""""''''''''''''''''''''''''''''''..-..--..'''.................."":"""':::':::^:'.-::-... ...........----''-.-'--''-.---''.....'---.---''.-..--'''....:":.'':'-....--'":"^"'::::::::--'^**^""""^^^^:":::''::'::'''''''''''''''""::::"":""""""*****^**++LL?+++*^^^"::^^^+??7711117?LLLLL????*++???**********++**************?</w:t>
+        <w:br/>
+        <w:t xml:space="preserve">|^:::"""":::::":::::":::::"::''''''''''''''''''''::'''''''''........."":"""':::'::'^"'..'''..-........ ............'--''-.---''.....'---.----'.-.-..'...-:'':'.---.'..'''-:^":::.:'::::::--'^""^""":"^^"':'':''--''''''''''::'::'':""::::""^^^^^****LLLLLLLLLL???+***^"::^^^??????L++??LLLL+********************++**************?</w:t>
+        <w:br/>
+        <w:t xml:space="preserve">|^^^^^^^^^^^^^^^^^^^^^^^^^"""'''''''''''':""::"""""":""::::'.....''''"":"""':::'::'":':..--..-....:---...-...................-'.....'---.---''.-.-....'-'"::''....-'':'^'':^:':'.''::::::--'^:::::'':::-':'':''--'':'':''''""::"::::::^^^**^?????LLLLLLL7777L7L??+***^"::^^^?????+?**++???++********************++**************?</w:t>
+        <w:br/>
+        <w:t xml:space="preserve">|^^^^^^**^^^^^^^^^^^^^^^^^""":::'''-''':::^^^^^^^^^^^^^^:::':::::-'':"":"""':':':''":'"'-..-........---.-..'--''-..--..................-.----'.-.....':-''.......':-"^^:''""::':'''::::::--::':::.'''---'-''::'::''"::"::::^^^^^^^"::^^**++???+++LLLLLLL7???*+*++??**^"::^^^****++?**+++++*********************^^^**************?</w:t>
+        <w:br/>
+        <w:t xml:space="preserve">|"""""""""""::"::^^^^^^^^^^""::::''-'''""^^^^^^^^^^^^^^^^"""^^^::"'':"":"""':':':'':'.:':...........--.....''.-'--.--''------......... ............'':'.-. ....''""-::':''':::':.''':::::--..''--..''-":::'::::""::*^^*^^^^^++***^^::^^*????++++**+++*+*+???^*^**+?**^"::^^^*^^***?****+++*********************^^^**************?</w:t>
+        <w:br/>
+        <w:t xml:space="preserve">|""""::::"""::"::"^^^::"":"^^""::''-'''""^"""^::^^^^^^^^^""^^^^^:"''::":"""':':':''"''-'":...:..................-..--''-...--.......'---.--.....''''''-.....:'.:^::':'''''::::''.''':::::--:..'::'''':^":"::::"^*^^???????++*++++*^::^*************^^^*^*+**^*^****^^^"::^^^*^^***+****************************^^^**************?</w:t>
+        <w:br/>
+        <w:t xml:space="preserve">|"""":::::::::::::"""::::::"""":'---''':::"""^::"^^^^""":::'::::::''::":"""':':':''"'.-'::...'-'::::'''-..--..........................-.---'-'--'-.-.....'''":.''''':'''''':::''.''':::::--':'::::::^^**^*^^':^^**????????***^*^^*^::^**^^*^^***^^*^^^*^^***^^^****^^""::^^^^^^***+****************************^^^**************?</w:t>
+        <w:br/>
+        <w:t xml:space="preserve">|:""::::::''::::::""::::::::::::'---''':::::""::"""""::::::':''''-''-:":"""':':':'':'.''''-....'''.'''''.-''''::'-'''''-..................---'-.'.....-.:::'''.''''':'''''::::''.''::::::-.'^^"^"^**++??+*^^':^^*??+*^***^***^^^^^^""^^*^^*^^^*^^^*^^^*^^***^^^^^*^^^""::^^^^^^********************************^^^**************?</w:t>
+        <w:br/>
+        <w:t xml:space="preserve">|:::::::::''''::::""::::::':::::'---'''::::::":::""":::::::':'''''''':":"""':':':'':'.''''-'..............'''''''.''''''-.''':::'.'.'.-.............'":-'''-''.''''':'''''::::''.':::::::-.'^^^^**?*?+++??*^':^**^^*^^^^^^^^^^^^^^^""^^^^^*^^^^^^^*^^^*^^***^^^^^*^^^""::^^^^^^***+**************************^^^^^^^************?</w:t>
+        <w:br/>
+        <w:t xml:space="preserve">|:::::::::::'':'':::::::::'::''''''-'''''':::":::::::::::::':'''''''':"::""':':':'':'.''''.'.'.........................-...--'.':..-':''.'''::-'.'-'::'-'''-''.''''''''''':::::'.':::::::--'^**^^^^^*****^^^':^*^^^^^^^^^^^^^^^^^^""""^^^^^^^^^^^^*^^^*^^***^^^^^*^^^""::^^^^^^***+**************************^^^^^^^************?</w:t>
+        <w:br/>
+        <w:t xml:space="preserve">|:::::::::::'':''::::::::''::''''''-'''''':::::::::::::::::':'''''''':"::""':':':''::.''''...''-::::'''-.-''..-................. ........-.'''.':'--'''.'''-''.''''''''''''::::'.':::::::-.'^^^"""^"^****^^^':^^^^^^^^^^^^^^^^^^^^""""^^^^^^^^^^^^*^^^^^^***^^^^^*^^^""::^^^^^^***+**************************^^^^^^^************?</w:t>
+        <w:br/>
+        <w:t xml:space="preserve">|:::::::::::'''''::::::::''::''''---'''''':::":::::::::::::':'''''''':"::""':':':''::.''''...''-'.'.''''.'''':::'-:::'''-.''::''.................-.-'''.'''-''.''''-'''''''::::'.':::::::-.:^^""""^"^^*^*^""':"^^^^^^^^^^^^^^^^^^^""""^^^^^^^^^^^^*^^^^^^***^^^^^*^^^""::^^^^^^***+**************************^^^^^^^************?</w:t>
+        <w:br/>
+        <w:t xml:space="preserve">|:::::::::::'''''::::::::''::''''---'''''':::":::::::::::::''''''''''::::""':':':''::.''''...'.'.''.----.-'''''''-'''''''.''':'':.-':'''.'''::.'.-.-'''.'''-''.''''-'''''''::::'.':::':::-.'^"""""^"^^^^^^""':"^^"^^^^^^^^^^^^^^^^""""^^^^^^^^^^^^*^^^^^^***^^^^^*^^^""::^^^^^^***+**************************^^^^^^^************?</w:t>
+        <w:br/>
+        <w:t xml:space="preserve">|:::::::::::'''''::::::::''::''''---'''''':::":::::::::::::'''':'''''::::""':':':''::.''''...'....'-----.---''''-.''''''-.''-.'.....'--'.--'''-'.-.-'''.'''-''.''''-''''''':'::'.''::':::--'^"""""^"^^^^*^""':"^^"^^^^^^^^^^^^^^^"""""^^^^^^^^^^^^*^^^^^^***^^^^^*^^^":::^^^^^^******************************^^^^^^^************?</w:t>
+        <w:br/>
+        <w:t xml:space="preserve">|:::::::::'''''''::::''::''''''''---'''''':::":::::::::::::''''''''''::::""':':''''::.''''...'.....-----.----'''-.'''-''-.-'--'.....'---.--'''.'.-.-'''.'''-''.''''-''''''':':''.''::':::--'^""""""^^^^^*^""':"^^"^^^^^^^^^^^^^^^"""""^^^^^^^^^^^^*^^^^^^***^^^^^^^^^":::^^^^^^******************************^^^^^^^************?</w:t>
+        <w:br/>
+        <w:t xml:space="preserve">|:::::::::'''''''::::''::''''''''---'''''':::::::::::::::::''''''''''::::""':':''''::.''''...'..'..-----.----'''-.'''-''-.-'--''....'---.---''.-.-.-'''.'''-''.''''-''''''':':''.''::':::--'^""::""^^^^^*^""':"^^"^^^^^^^^^^^^^^^"""""^^^^^^^^^^^^*^^^^^^***^^^^^*^^^""::^^^^^^********************************^^^^^****^^^*****?</w:t>
+        <w:br/>
+        <w:t xml:space="preserve">|:::::::::::'''''::::''::''::''''---'''''':::::::::::::':::''''''''''::::""':':-''':''''''...'..'..-----.----'''-.''--''-.-'--''....'---.---''.-.-.-'''.'''-''.''''-''''''''':''.''::':::-.'^""::""^^^^^^^""''"^^""^^^^^^^^^^^^^^""::"^^^^^^^^^^^^*^^^^^^***^^^^^*^^^":::^^^^^^********************************^^^^^****^^^*****?</w:t>
+        <w:br/>
+        <w:t xml:space="preserve">|::::::::'::'''''::::''''''::''''--.'''''':::::::::::::':::''''''-''.::::""':':-''':'.''''...'.....'----.-----''-.''--''-.---'-'....'---.----'.-.-.-'''.'.''''.''''.''''''''':''.''::':::-.'^""::""^^^^^^^""':"^^""^^^^^^^^^^^^^^""::"^^^^^^^^^^^^^^^^^^^***^^^^^*^^^":::^^^^^^********************************^^^^^****^^^*****?</w:t>
+        <w:br/>
+        <w:t xml:space="preserve">|::::::::''''''''::::''''''''''''--.'''''':::::::::::::':::''''''-'''::::""':':-''':'.''''...'.....'----.-----''-.''--''-.---'......'---.---''.-.-.-'''.''..''.''''.''''''''':''.''::':::-.:^"":"""^^^^^^^""''"^^""^^^"^^^^^^"^^^""::"^^^^^^^^^^^^^^^^^^^***^^^^^^^^^""::^^^^^^********************************^^^^^****^^^*****?</w:t>
+        <w:br/>
+        <w:t xml:space="preserve">|:::'::::'::'''''::::''''''''''''--...''''::::'''::':''''''''''''-'''::::":':':-'''''.''''...'.....'----.-----''-.''--''-.---'......'---.----'.-.-.-'''.-'..''.''''.''''''''':''.''::':::-.'^"":"""^^^^^^^""':"^^""^^^"^^^"^^"^^^""::"^^^^^^^^^^^^^^^^^^^***^^^^^^^^^":::"^^^^^****^^************^^************^^^^^^^^^^^^^^***^</w:t>
+        <w:br/>
+        <w:t xml:space="preserve">|:::'::''''''''''':::''''''''''''--...''''::::'''::':''''''''''''-'''::::":':':-''':'.''''...'.-...-----.----'''-.-''-''-.-'--......'---.---''.-.-.-'''.''..''.''''.''''''''':''.''::''::-.'::::""""^^^^^^""'':^^""^^"""^""^^"^^^""::"^^^^^^^^^^^^^^^^^^^***^^^^^^^""":::"^^^^^****^^************^^************^^^^^^^^^^^^^^***^</w:t>
+        <w:br/>
+        <w:t xml:space="preserve">|:::'::''''''''''':::''''''''''''--...''''::::'''::':''''''''''''-'''::::":':':-'''''.''''...'.-...----..-'---''..-'--''-.----.......---.----'.-.-.-'''.''..''.''''.''''''''''''.''::''::-.':"::""""^^^^"^""'':^^""^^"""^""^^"^^^""::"^^^^^^^^^^^^^^^^^^^***^^^^^^^""":::"^^^^^****^^************^^************^^^^^^^^^^^^^^***^</w:t>
+        <w:br/>
+        <w:t xml:space="preserve">|::::::::''''''''':::''''''''''''--...'''':::''''::''''''''''''''-'''::::":':':-'''''.''''...........................................................'-.'...'-.''''.''''''':''''.''::''::-.':"::""":^^^^"^""'::^^""^^""""^^^^"^^^""::"^^^^^^^^^^^^^^^^^^^***^^^^^^^""":::"^^^^^***^^^************^^************^^^^^^^^^^^^^^***^</w:t>
+        <w:br/>
+        <w:t xml:space="preserve">|::::::::''''''''':::''''''''''''--...'''''':''''::''''''''''''''-'''::::::':':-'''''.'.'..... ................................................. ..............''''.''''''''''''.''''''::-.':"::""":^"^^^^""'':^^""^^""""^^^^"^^"""::"^^^^^^^^^^^^^^^^^^^***^^^^^^^""""''"^^^^^^**^^^************^^************^^^^^^^^^^^^^^***^</w:t>
+        <w:br/>
+        <w:t xml:space="preserve">|::::::::''''''''':::''''''''''''--...''''''::'''::''''''''''''''-'''::::::''':.''-............................----------'-..--..'.':-----'-'---...........   .........-....-'.'.''''''--'.':^::""":^"^^^^""'':^^""^^""""^^^^^^^"""::"^^^^^^^^^^^^^^^^^^^***^^^^^^^""""''"^^^^^^**^^^************^^************^^^^^^^^^^^^^^***^</w:t>
+        <w:br/>
+        <w:t xml:space="preserve">|::::::::''''''''':::''''''''''''--...''''''::'''::''''''''''''''-''''::'::''''.'-..........-''...'--------'------.''-'-...--.........-...'.-.-..---'-.............................'.......':^::""""^"^^"^""'':^^""^^"""^^^^^^^^"""::"^^^^^^^^^^^^^^^^^^^***^^^^^^^""":''"^^^^^^***^^*****^^*****^^************^^^^^^^^^^^^^^***^</w:t>
+        <w:br/>
+        <w:t xml:space="preserve">|::::::::''''''''':::''''''''''''--...'''''':''''::''''''''''''''-'''':''''.'.-..........--'.-......---...-'.--..--'..'--..--........--.-.'.-....--.''''''.................................':^::""":^"^^"^""'':^^""^^"""^""^^"^^"""::"^^^^^^^^^^^^^^^^^^^***^^^^^^^""":''"^^^^^^***^^*****^^*****^^************^^^^^^^^^^^^^^***^</w:t>
+        <w:br/>
+        <w:t xml:space="preserve">|:::'::''''''''''':::''::''''''''--...'''''':''''::''''''''''''''-''''''..............-'''-..-......--..----..-....'-.'--........................-..-''-':..:'-''''-'''....................':":::"":^"^^"^""'':^^""^^""""""^^"^^"""::"^^^^^^^^^^^^^^^^^^^***^^^^^^^""":''"^^^^^^***^^*****^^*****^^************^^^^^^^^^^^^^^***^</w:t>
+        <w:br/>
+        <w:t xml:space="preserve">|:::'''''''''''''':::''::''''''''--...'''''':''''::''''''''''''''-'''............--'''''''-............................-...-.:'''.'':'''.'''::.:....'''-'....'.''''''''''-'''''....'........::::::::":^^"^""'':"^""^^""""""^^"^^"":::"^^^^^^^^^^^^^^^^^^^***^^^^^^^""":''"^^^^^^**^^^*****^^*****^^************^^^^^^^^^^^^*****^</w:t>
+        <w:br/>
+        <w:t xml:space="preserve">|:::'''''''''''''':::''::''''''''--...'''''':'''''':'''''''-'''''''''.........'.'':::'''''............'-.-''':::'-'::'''-.'''''':..-'.--.-...........''.'....-.'''''''''''':::'':'''':-''.-.':::::'':':":"::'''""::^"""""""^^"^^""::::"^^^^^^^^^^^^^^^^^^***^^^^^^^""":''"^^^^^^**^^^*****^^*****^^************^^^^^^^^^^^^*****^</w:t>
+        <w:br/>
+        <w:t xml:space="preserve">|:::'''''''''''''''''''''''''''''--...'''''':''''::'':::'''-'''''''''......'-.''::'':'''''...'':::::''''.''''''''.''''''...-....................''......'....'.''''''''''-''':':::''::::-''....'-..'----':'--''::''":::":"::"::::"::::"^^^^^^^^^^^^^^^^^^***^^^^^^^""":''"^^^^^^**^^^*****^^*****^^************^^^^^^^^^^^^*****^</w:t>
+        <w:br/>
+        <w:t xml:space="preserve">|:::'''''''''''''''''''''''''''--........''''''''''''''''''''''..''''...'''''::'::'''''-''...'''''.'-...............................::''....... ''':'.'......'.''''''''''-''''.''''':::""::..'''.....-...-'------''"''::'''':'''::''':::""":"""^^^^^^^^^^^^^^^^^^^^""":''"^^^^^^**^^^****^^^*****^^************^^^^^^^^^^^^*****^</w:t>
+        <w:br/>
+        <w:t xml:space="preserve">|''''''''''''''''''''''''''''............-...............--..........'..:::':::'::'''''''....'......................''''-.   ......    ...........-'':'-'......''''-''''--''''.'''.'':':::':::::::'----.---.---...-:''''''''''''''''''::''''"""""""^^""""^^^^^^^^^^""":''"^^^^^^**^^^****^^^*****^^************^^^^^^^^^^^^*****^</w:t>
+        <w:br/>
+        <w:t xml:space="preserve">|'---''-----------'''--''-...........................................':::""':':'::'''''..''-........:''-.       ........... ... .......  ..........-'''-:"':.....---''''-'':''.'''.'':':-:'^""::""^''''''''-'''''''..-.--'-...'''''--'''''''::::::::::::"^^^"""^^^^:::''''^^^^^^**^^^**^^^^^^^^^*^^********^^**^^^^^^^^^^^^*****^</w:t>
+        <w:br/>
+        <w:t xml:space="preserve">|.........--..-........--....................................  ......':""":':':''':''.-.-:-..-...  ...  ...-'-' ..         .               ...........-.'::'":.-'....-.'-'''''.'''.'''':::'"::::***^:::::^^''''''''''''''''''....-------'''':''''''::::::^^^:"::::"'':''''"""""^^^^""^^^^^^^^^^^*^^********^^^^^^^^^^^^^^^^*****^</w:t>
+        <w:br/>
+        <w:t xml:space="preserve">|....................................................................::^'":':':''':''..-"'...     .   .            .   ........   ......-.... .  ..'......'::'."::--......-'''.'''.'''':::'::::::"^:^^^^^^^^^^^^^^^'''':''''''''''''''--.......--''::':'':::':''::"'''''''''"::::^^""^^^^^""^^^^^^^^^^*****^^^^^^^^^^^^^^^^^^***^</w:t>
+        <w:br/>
+        <w:t xml:space="preserve">|...................................................-------''''''''''::"'":':':''::-..:':'............ ........---..  . .......            .    . ...'-......'.":""'::''....-'..''.'''':--':::::::":^"^^"^"^^^^^^^^^^^^^^^^^:'''''''''''''''''''-'''''-'----':'''''''''''-''":::::::::::::::"^^^^^^^^^^^^^^^^^^^^^^^^^^^^^^^^***^</w:t>
+        <w:br/>
+        <w:t xml:space="preserve">|............................----------------------.----'''-:::-:''''::''":':':'':'.'."''.............        .   ..  .. .....-'''''-..  .         . ..........''':-""::'-'........'''':--':::::::::^"^^"""^"""^^^^^^^^^^^^^^^^:::::''''::::::'''''''''''---''-----''-'''-''''''''''''':::::"""""::""::::^^^^^^^^^^^^^^^^^^^^^^^^</w:t>
+        <w:br/>
+        <w:t xml:space="preserve">|'...--..--------.--.........:::::::::::::::'''''''-''''''''::::::''.:'''::':':''..':.:'...   ............... ...           .  ............    .........  '.....-''-'::^'':"'''....'''':--':::::::::^"^^:":^"""^^^^^^^^^"""^^^^""""::"""""^^::'':':::::''''''''''''''-'''----''..''''''''''''''''::""::::^^::^^"""""""^^^^^^^^^^^</w:t>
+        <w:br/>
+        <w:t xml:space="preserve">|':::::::':::::::::::::::'::::::::::'':::':::::::::::::::::':::'''...:'''":':</w:t>
       </w:r>
       <w:r>
         <w:rPr>
@@ -411,7 +394,7 @@
           <w:sz w:val="4"/>
           <w:szCs w:val="4"/>
         </w:rPr>
-        <w:t xml:space="preserve">"''-.-:    .......-.  ......    .....    ..--''''''''''''   . ................. .    .       . </w:t>
+        <w:t xml:space="preserve">':-..-:^.'..-...  .....   ....  ....-'''''  .  ..      ..  .                   </w:t>
       </w:r>
       <w:r>
         <w:rPr>
@@ -423,17 +406,15 @@
           <w:sz w:val="4"/>
           <w:szCs w:val="4"/>
         </w:rPr>
-        <w:t xml:space="preserve">:'.....'-::::""""^^^^*:":^***^^^^:""""'''''''''''':::::::":^^^^^^"^^^^^""""^^^^"^^^"^^**^^^^^^^^"^^*******^"^""""^^^*******^^****^^***^^^^^</w:t>
-        <w:br/>
-        <w:t xml:space="preserve">|----...........................................-'-''--''''''''''''''''''::':':::-:'^*::'-.-:         .....  .................... ..   ....-''-.............       .. .........     .  .:''.-'..'':'::"^^^"^:":^**??**++^^^^:::''''''''''':::::::::::"^"^^^^^""""^^^^"^^^^^^**^^^^^^^^"^^^^^""**^""""""^^^*************^^*******^</w:t>
-        <w:br/>
-        <w:t xml:space="preserve">|.-..........................'''''''''''''''''''-:''''''''''':::::':''''":::"""":':'^::''.-'..........  ...........---'--.-..... .  ................. .... .  ......................... ..:"''-..'-..':"^^"::":"**^*????****^^^^':::'''''''''''::::::"":""^^^""""^^^^"^^^^^^*^^^^^^^^^"^^^^^""""^""""""^^^^^^^^^****************^</w:t>
-        <w:br/>
-        <w:t xml:space="preserve">|--.........------..-----'''''':::::::::'::'::::''''''''''::::"^^^^:::::"::'::"":::'"::-'-'''''''-   ..................... ..   .        .. ...... .  ....  ...--'''''''':'''''''....  .... :'':'':..''-::':':::^^^*^^^^??+++++^":::'':::'':::''''''::''''^^^:::"^^^^"^^^"^^**^^^^^^^^"^^^^^""""^""""::^^^^^^^^^^^^****^********^</w:t>
-        <w:br/>
-        <w:t xml:space="preserve">|''''----...''''''''::::::::::::""":::^:::::::::"''''''''''':^:":::''''::::':':::':'::'.-'"----............    ..  ..  ..    .  .     .    .         ..   .........----'-----'............... '^^::'.''-.:''':':^^^*^^^^^^^^****^":""^^^^:"^^^:::::'':'''''''':::""^^"^^^"^^^*^^^^^^^^"^^^^^""""^""^^"""^^^^^^^^^^^****^^^^^^^^*^</w:t>
-        <w:br/>
-        <w:t xml:space="preserve">|::::::::'''''''''':::"""""""""""^^^^^^^^^^^^^^^:''''''''''':"::'''''''-''''''''''''''.</w:t>
+        <w:t xml:space="preserve">:'.....-'':::'"^":::-:.....-''':::::::::^"^^"^:^:::^^^^^^^^^""""^^^^^"""""""""^^^^^^^^^*::::':''''''''''''''''''-''...---....-'''''''::''::::::::^^""""""""":::""""""</w:t>
+        <w:br/>
+        <w:t xml:space="preserve">|::::::::::::::::::::::::::'''':::::'':''''''''':::''''''''-:::'''...:'''":':''.-':":...'.. . ......---.....    ........... ...  .....---''-.-........ .      .'...-..'''-'":^":-::.'.-'...:::::::::^"^^:^:^:::^^^^^^^^^":""^^^"""""""^^^"^^^^^^^^^*********''''''::::::'''''''''''''-...-''''--'''''.:::::::''::::::::::::""""""</w:t>
+        <w:br/>
+        <w:t xml:space="preserve">|:::::::::::::::::'':''''::''''''''''':''''''''':::''::':''''''..'..':'''":'--.-:^:::..-.....       .  ........    .  . .   .....   .......   ...   ..---'''''' ':''....'-'::':^-"""::'''--::::::'''^:^^:":":::^^^^^^^"^:::"^^^"""""""^^^^^^^^^^^^************^****^^::::::::::::''''--'''''--'-'''''...........:::::::::::::::::</w:t>
+        <w:br/>
+        <w:t xml:space="preserve">|:'''::'''::''':::'':''''::''::''''''':::''''''':::''::::''''''..'..':'''":-.-''^^::... ...  ...---'-'''''--... ....  .       ..... ........--...... .. ...........-'......'''::-""""^^^"''::::::::::'::'":":::^^^^^^^"^:::"^^^":""""""^^^^^^^^^^^^**^^^*********^*^^^^^^^^^^::::::::::::'''--'''''""::::.......--''''--..:::::::</w:t>
+        <w:br/>
+        <w:t xml:space="preserve">|:'''::'''::'''''''':''''::''::''''''':::''''''':'''''':'''''''..</w:t>
       </w:r>
       <w:r>
         <w:rPr>
@@ -445,7 +426,7 @@
           <w:sz w:val="4"/>
           <w:szCs w:val="4"/>
         </w:rPr>
-        <w:t xml:space="preserve">.'"...........   .....  ............................ ...................''..  ........  ..........  ....''^^^':'':--'':'':^"^:^^^^^^^^^^*^":"^^++^^^**^"""":::::''::":':::"""^"^^^""^^*^^^^^^^^"^^^^^""""^""^^""""^^^^^^^^^^^^^^^^^^^^^^^^</w:t>
+        <w:t xml:space="preserve">'..':'''"'--'"'"^''..:....   ..........   ..   ...--'-'''''''     ...  .........  .           .   ..:'.....</w:t>
       </w:r>
       <w:r>
         <w:rPr>
@@ -457,8 +438,13 @@
           <w:sz w:val="4"/>
           <w:szCs w:val="4"/>
         </w:rPr>
-        <w:br/>
-        <w:t xml:space="preserve">|"^""""":::'''''''::"""""""""""^^^::::::::::::::":'''''''-'':''''''''''-''''''''''.''..</w:t>
+        <w:t xml:space="preserve">..':-::::^^^"'':^"^:::::":::--':'':""""^^^^^:""""^^"::"""""""^^^^^^"^"^**^^^^^**^^^**^^******^^^^^^^"^^^^::::':::::::::""::::::::^^:::''''--...-----:</w:t>
+        <w:br/>
+        <w:t xml:space="preserve">|:'''::'''::''''':'':''''::''::''''''':'''::'''':'''''':'''''''..'...'''':--':^''"'...  ......  ................. .  ...............  ...  ....................  ..    :---.....':::::^"^'':^^*^^^:""^""::--'''''''":::":""":^^""::""""""^^^^^^"^"^**^^^^^**^^^^^^^^^^***^***^^**^^^^^^^^"^^^::::::^^^^^^^^::^^:::::::::::::----:</w:t>
+        <w:br/>
+        <w:t xml:space="preserve">|:'''::'''::''''':'':''''::''::''''''':''':::''':::'''':'''''''..'...'''--''"^^'':..'....  . .................   .    . .. ..... . ...  ....--'''''''''''.... ...   . .. -:'.....'.''::::'':^?***?^^^*^^"::::''::'''''':':::::^"::""""""""^^^^^"^"^**^^^^^**^^^^^^^^^^^^^^^^^^^**********"^^^^^^^^^***^^^^^^^^^^^^^^:::::::::::::</w:t>
+        <w:br/>
+        <w:t xml:space="preserve">|:'''::'''::''''':'':'''':'::::''''''''::''':'''':::''':'''''''..</w:t>
       </w:r>
       <w:r>
         <w:rPr>
@@ -470,9 +456,7 @@
           <w:sz w:val="4"/>
           <w:szCs w:val="4"/>
         </w:rPr>
-        <w:t xml:space="preserve">''........ ........ ...--.-.-.--''''-'-.-......... .... ........  ...........................................^^^:^:'''"'':-':'"::^^^^^^^^^:::^***++*+***^^""""":::""^::''':""":""""""^^^^^^^^^^"^^^^^""""^""^^::""^^^^^^^^^^^^^^^^^^^^^^^^</w:t>
-        <w:br/>
-        <w:t xml:space="preserve">|^^"""""":::'''''':":::::::::::::::'::'::::'::''''''''-'.-''''''''''.--'...'..........."....... ...... ......--'''''''''::''''''-...................  . ............  ...........-.-................ ..^^^:::":'--':':'':"""^^^^^:::^*^**+?&lt;????^**^*""^^^^^"::::::':''"":::""^^"^^^^^"^^^^^""""^""""::""^^^^^^^^^^^^^^^^^^^^^^^^</w:t>
+        <w:t xml:space="preserve">'...''-.'''^^:''..'...........   .. .  .  ........     ..    .  .  .....   ............   ..     ..--''''''</w:t>
       </w:r>
       <w:r>
         <w:rPr>
@@ -484,8 +468,29 @@
           <w:sz w:val="4"/>
           <w:szCs w:val="4"/>
         </w:rPr>
-        <w:br/>
-        <w:t xml:space="preserve">|::::::::"":''--''::'''''''::::''''''''':''':'''''''--.-.-'''''''''..................'". . ......  . ............--''-'-'.-.-.....................................  ..............--'-''...... .... ......^":"::::'-''''':::"::"":::^^^^^^^&lt;LLLL?L???^**^*^^^""::"":"'''''''"""":""^^^"^^^^^""""^""""::"""^^^^^^^^^^^^^^^^^^^^^^^</w:t>
+        <w:t xml:space="preserve">:''.'....':::'':^**^*?****?*^^^::::::'':'''''''':::::::"""""""^^^^^"^""**^^^^^**^^^^^^^^^^^^^^^^^^^^^*^^^***********^^^**********^^^^^^^^^^^^^^^^::::</w:t>
+        <w:br/>
+        <w:t xml:space="preserve">|''''::'''''''''':'':''''''::''''''''''::''':'''::::''':'''..........'--'^":^::'..'.....  ... .  ......................  .. .        .  .  .. .  ......................   ...-:'-'....''-'':^"^^^^^^+?+??^^::::^^"":''''''''':'''''::::::"^^^"""^""^^^^^^^**^^^^^^^""""^^^^^^^^^^*^^^*****^^****+****LLL*****^^^^^^^^^^^^^^^^^^^^</w:t>
+        <w:br/>
+        <w:t xml:space="preserve">|''''::'''''''''':'':''--''''''-----'''::''''---''''-''''--..........--:"**:::''..'    .... ....--'''''''''''''--... ... .  ..... ..........   . ........---'-.......   . ......-:''......''::"^""""^****?^"::"^*^^":"":''''''''''':::::::::::""^""^^^^^^^**^^^^^^^""""^^^^^^"^^^*^^^*****^^*****^^**LLLL&lt;&lt;&lt;&lt;LL*^^^^^^^^^^^***^^^</w:t>
+        <w:br/>
+        <w:t xml:space="preserve">|''''''''-''--------'''--'......----'''''-'''...'''...............''.':"^^^::'-'-".     ...  .......-..........      .......-'-''''''''''     ................ . .    .        . .::''....'.:':::"""^^^^^*+"::^^***^^^^^"""""''''''''''::::::::::::^^^^^^^**^^^^^^^""""""^^^^""^^*^^^*****^^^^***^^*******&lt;&lt;&lt;LL***^^^^^^^^^******</w:t>
+        <w:br/>
+        <w:t xml:space="preserve">|''''''''------------...........................''''''''...'......''.'^*^^"''-.':  ... ............  .......................      ''----.............     .  ..  .. ..........     .::'-''''.''::'::"^^^^^^:::^^*??+++??^^^^"::::'':::'''''':::::::^^::::^**^^^^^^^""""""^^^^""^^*^^^*****^^^^***^^^^********^^^^^^^^^^^^^^******</w:t>
+        <w:br/>
+        <w:t xml:space="preserve">|'-----------..............''...----''-''---'-'''''''::'''''...''.--:"^*"""'-.''        .......  ..........-..............   ..........................  .......................... ..."-'-::.'--.'':^^":^":::"**^^?????++**^^^^^'':::'':::':'''':::::::::^^^:^^^^^""""""^^^^""^^*^^^*****^^^^^^*^^^^****^^^*^^^^^^^^^^^^^^****??</w:t>
+        <w:br/>
+        <w:t xml:space="preserve">|--------........---.-----'''''----''''''''''''':'''"""::::'::::::--""^":":'.-'............  ...............---.....   .  ........................... ....--''''''''''''''''--.... ......''::'::-..''-::'":::::^^^^+*^+?????*+++^^""":::::::::::''::::::::::^:^^^^^""""""^^^^""^^^^^^*****^^^^^^*^^^^^^^*^^^^^^^^^^^^^^^^^^^^^^^?</w:t>
+        <w:br/>
+        <w:t xml:space="preserve">|-------------------'''''':''::''--'''''':::::::""""""^^^"":^^^^^"::""^::"'..':'''''''-. ..................... ...... .... .     ....... .... ..... .........-'''''''''''''-...............:^^:::''''---':'':':"^^^*^^*^^^*??****^^"""^^*::"""^:::::::::::::''''''^""""""^^^^""^^^^^^*****^^^^^^^^^^^^^^^^^^^^^^^^^^""^^^^^^^^^^^</w:t>
+        <w:br/>
+        <w:t xml:space="preserve">|----'''''''''''''''''':::"::'''''''''''::""^^^^^^^^^^^^^""":::^^"^^"^":'''.':..''............... ...   ....  .............. ......... .....   .......  .....................  ...  .......'.'"^":::''--':'':'':^:"*^^*^^^^*^^^*+*^""^^**^^*^^^"^^^:::::::::::::'':::::"""^^^""^^^^^^*****^^^^^^^^^^^^^^^^^^^^^^^^^^^"^^^^^^^^^^^</w:t>
+        <w:br/>
+        <w:t xml:space="preserve">|'''''''':::::::::::::::::"""::'''''''':::^^^"^^^^^^^^^^^":'::::::'':^::...'"-''--.-........ ........ .............................. ..............................  .........................  .^*^::^:::'':''-:':^:"^^^^^^^^^^^*^""^^**????^*^**^"""^^:::::::::""::::::"""^""^^^""^****^^^^^^^^^^^^^^^^^^^^^^^^^^^^^""^^^^^^^^^</w:t>
+        <w:br/>
+        <w:t xml:space="preserve">|:"":"""":::^^^^^^^^^^^^^^"""::::''''''"""^^^:"""""""""::::''''''''''":'..''............ ........ ...............'-'.............. ..............  ............... .............................   .^^*":"':'''--'':':::":"^^^^^^^^::"^*?+++?+++?******^"^^^:::""^":::''':"""::""^"""^^^^^^^^^^^^^^^^^^^^^^^^^^^^^^^""""^^^^^^^^^</w:t>
+        <w:br/>
+        <w:t xml:space="preserve">|^^^^^^^^^^^^^^^^^^^^^^^^^^""::::''''''""^""::"::::::::::::'''''''''':</w:t>
       </w:r>
       <w:r>
         <w:rPr>
@@ -497,14 +502,7 @@
           <w:sz w:val="4"/>
           <w:szCs w:val="4"/>
         </w:rPr>
-        <w:br/>
-        <w:t xml:space="preserve">|::''''''::'------':'''''''::::'''''''-''''-''''-''-...-...........................'''...................''................   ......  .......'.''''''''''''''--.. ............................. .  ...   ...."::""::'''''''':'':::::""^^^^^****LLLLL?????***^"":"^^"":::""''""""""""""::^^^^""""^""""::"""^^^^^^^^^^^^^^^^^^^^^^^</w:t>
-        <w:br/>
-        <w:t xml:space="preserve">|::'''''''''------''''''''''''''''''''.-....-..........-...........................'::...........................  ........................... ....':::   ...''.........  ......................   ........  ...^*^"::''''''''''''::::^^^^^*^^^**?*LLLLL?+?**""""^^"^"""""""^^"""""""":::::::"""^""""::"""^^^^^^^^^^^^^^^^^^^^^^^</w:t>
-        <w:br/>
-        <w:t xml:space="preserve">|::'''''''''------'''''..-.--'--..-....................-'..........................':.........  .   .......... ................................ . .....-''''''-..&lt;:.............    ..   ...................  .....*^^:::':''''''':'''::":^*^^^^^****?*LL??+*^^""^^"^^*"^^^^*^""""""""""":::::::"""""::"""^^^^^^^^^^^^^^^^^^^^^^^</w:t>
-        <w:br/>
-        <w:t xml:space="preserve">|''''''''.....--......................................-.'-....--...'.......-....-':'....................... ...............'''''-''...........  ............--...: ...............  ..................................^^^:":'::''':'''''::"^"^^^^*^^^****+?+*^^""^^^*^*****^*^^^^""^"""^":::""::"""""::"""""^^^^^^^^^^^^^^^^^^^^"</w:t>
+        <w:t xml:space="preserve">'..::..................  -..-'''''''''''::'::::'''''-..................... . ............. .............''''''''--......... .....*^*::::::-'':'''':'""""^^^"^:::^+*^*+?&lt;&lt;&lt;??&lt;??***^**^^^^^^^"::::"':'':''""":::"^^^^""^^^^^^^^^^^^^^^^^^^""^^^""""^^^^^^^^^</w:t>
       </w:r>
       <w:r>
         <w:rPr>
@@ -517,7 +515,7 @@
           <w:szCs w:val="4"/>
         </w:rPr>
         <w:br/>
-        <w:t xml:space="preserve">|'-.-.........--...................................--.'-'-''-'''''''':':'::':':</w:t>
+        <w:t xml:space="preserve">|^^^^**^^^^^^^^^^^^"^"""":"^^""::'''''':::::'::::::::::::::'''.''</w:t>
       </w:r>
       <w:r>
         <w:rPr>
@@ -529,13 +527,77 @@
           <w:sz w:val="4"/>
           <w:szCs w:val="4"/>
         </w:rPr>
-        <w:t xml:space="preserve">........................  ...............-''''''''--.........  .................'^..  ............ .........-......--.................. ..^^^::"''::''''''':":""""*^^^*^^^^??*^^""^^^**++&lt;***?+?^^^^^^^"^^:::""::"""""::"""^^^^^^^^^^^^^^^^^^^^^^"</w:t>
-        <w:br/>
-        <w:t xml:space="preserve">|.............''.............-...........'''''--'''---'-'-''''::'''.....-------'''''''''''''''''---.  ................--------.-..........  ................. ^?^..-''......-... .'..-'''''''''''''':'':''-'''-....... .....^^^:::::''''''':::::"^""^*^^^^***^^""^^^*+LL&lt;7777+???++^^^^^^"::""::"""""::"""^^^^^^^^^^^^^^^^^^^^^^"</w:t>
-        <w:br/>
-        <w:t xml:space="preserve">|............-''--....---...'''''''''''''':'::::'''''''''............-.. .....''''':::":::::"::  .... .................................   ........... ...... "*7*'.-":'.......  .-..--''''''''::::::::::::::''''-.... .........^"::::'::''''''''::::"^^"^^*^^^^""^^"*?LL????77????+****+^"""^^::"^^""::""""""^^^^^^^^^^^^^^^^""^"</w:t>
-        <w:br/>
-        <w:t xml:space="preserve">|--..---....--''------'''-''':::::::::'':: .........-......................... . ..   ...::'--.--......---.. ......................   ...   ................:":......''......  ........---'''''::::::::::'''''''-.... ............::":":''':'''''''::":""^^^^""""^^"*???**???L77????</w:t>
+        <w:t xml:space="preserve">.''''..."^............... .........''''''::'::::'''''''-.... ................................. .&lt;:...........--'''''--.......... ........^::::":'''''''''::::::::":::^*^^^****&lt;LL7L??L???*****^^^^""":""""":''''''::""""":"^^^^^""^^^^^^^^^^^^"""^^""""^^^^^^^^^</w:t>
+        <w:br/>
+        <w:t xml:space="preserve">|^^^^*""":::::^::"""^::::::""""'''''''''''::'::::::':'''''''.........'.''^.............  ...........----''''-'-----....... .............'---''''''''''''--..  ...: ............................  ...... . ...::^":::'':'''''''''''::::^^^^^^^^*****LLL7L??????****^""""""^"""""""''''"""""::""""^""^^^^^^^^^^^^"""^^"""""""^^^^^^</w:t>
+        <w:br/>
+        <w:t xml:space="preserve">|"""""""":::::":::::"::::::'''''''''''-''''''''''::'.''................'"...  ..............-'..  .....-..........  ............. ....'''''''''::::::'::  .....'^..  .........................    ..............*^^"::"'''''''''''':::"""^^^^^*^^^****?LLLLL?????*^""""""^""^""""""""^""""""""""^:::::^^^^^^^^^"""^^"""""""^^^^^^</w:t>
+        <w:br/>
+        <w:t xml:space="preserve">|:""::::::::::":::::"::::::''''-'--'''-''-...-''.''..'................'".............................--.   .....-........................ . ...   ..:::------ ^?^..-''..... ..........   --................  ......*^^*:::':'''''''::':::""^"^*^^^^^^*?*++?LLLL??**^^^"""^""^"""^^^""^^^^""""""""":::::::::^^^^"""^^"""""""^^^^^^</w:t>
+        <w:br/>
+        <w:t xml:space="preserve">|:""::::::::::"''''':''''':''..--..'''...-...........................':............................... ........................-.........    ...-..''''''''' "*7*'.-":'.......... ....................................*^^^:":'::'''":''':'::"^^^^^^^^*+***??++*??+*^^^"""^^"^^^**^^^^***^"""""^""""""""::::::^^"""^^"""""""^^^^^^</w:t>
+        <w:br/>
+        <w:t xml:space="preserve">|:"''''''''''':'''--'-----.''......'''..............................':".......... .. . ..........-. .............---..---------..........  .......----'----.:":......''......... ............-..----................... .^^*^::"'''"":''''':::":""^"^^*^*******???+^^^"""^^^*******++****^**""^^"""^"""""""":^^""""""""""""""^^^^</w:t>
+        <w:br/>
+        <w:t xml:space="preserve">|''''''-------.-----.............--'''-.........'''.......''.....''''"...... .................--  .............---'''''''''---..-......  .................. "'      ...'.......  -....-..----.---''''''''-----.-....... ....^^^^:::""::''''''':::::"""^^*^****^***+^^^"""^^^+**+LL1++??++?**^^^^^""^^""""""""""""""""""""""""^^^^</w:t>
+      </w:r>
+      <w:r>
+        <w:rPr>
+          <w:rFonts w:ascii="Courier New" w:hAnsi="Courier New" w:cs="Courier New"/>
+          <w:b/>
+          <w:bCs/>
+          <w:color w:val="FFD6AA"/>
+          <w:spacing w:val="4"/>
+          <w:sz w:val="4"/>
+          <w:szCs w:val="4"/>
+        </w:rPr>
+        <w:br/>
+        <w:t xml:space="preserve">|''''''--........................---'''..-..--..'::''''''''':::::</w:t>
+      </w:r>
+      <w:r>
+        <w:rPr>
+          <w:rFonts w:ascii="Courier New" w:hAnsi="Courier New" w:cs="Courier New"/>
+          <w:b/>
+          <w:bCs/>
+          <w:color w:val="FFECCB"/>
+          <w:spacing w:val="4"/>
+          <w:sz w:val="4"/>
+          <w:szCs w:val="4"/>
+        </w:rPr>
+        <w:t xml:space="preserve">-'':........................  .............-.----'''''''---.......... ....................': .'':'-. ...-.... .'...-''''''''''''::'::::::'''''''-.............^^^""":::::'''':''':::::^""^**^^***+^^^"""^"^+++7LL11111++???++^^^^^^^^"""^^""""""""""""""""^^^^^^</w:t>
+      </w:r>
+      <w:r>
+        <w:rPr>
+          <w:rFonts w:ascii="Courier New" w:hAnsi="Courier New" w:cs="Courier New"/>
+          <w:b/>
+          <w:bCs/>
+          <w:color w:val="FFD6AA"/>
+          <w:spacing w:val="4"/>
+          <w:sz w:val="4"/>
+          <w:szCs w:val="4"/>
+        </w:rPr>
+        <w:br/>
+        <w:t xml:space="preserve">|.--.....................-.....'-''-'''''''''''''""":""::::</w:t>
+      </w:r>
+      <w:r>
+        <w:rPr>
+          <w:rFonts w:ascii="Courier New" w:hAnsi="Courier New" w:cs="Courier New"/>
+          <w:b/>
+          <w:bCs/>
+          <w:color w:val="FFECCB"/>
+          <w:spacing w:val="4"/>
+          <w:sz w:val="4"/>
+          <w:szCs w:val="4"/>
+        </w:rPr>
+        <w:t xml:space="preserve">'^..........--.-''---------..... ................----------..-........... ..................... ''-::":'.''  .....  -..---''''''''':::::::::::::'''''--..... .........."::::::":::'''''''''::::^^^^"**^^"^^"""^""+LL7L7&lt;LL1111LLL++***++^^^^^^*^""""^^^"""""""""^^^^^^</w:t>
+        <w:br/>
+        <w:t xml:space="preserve">|..............-----.-----.'''''''''''''':""::"""""....---------''''''''''''''''''''''-.  .......................................   ........  ... ........-:.:*^^"''':'. -.   ........--'-''''':::::::::::''''''----... .............:^^^"":"::::'''''''':""::"^^^^""""""^""*LL?**+LLLL77LLLLLLL*++??**^^****^^^^^"""""""""""""^^</w:t>
+        <w:br/>
+        <w:t xml:space="preserve">|...----------.--''''''''''''''''''''''''............ . ....''''''''':::":::::"""   .......   .................................  . . .................... '-:^7+^":''::' -.  ..........-------'''''''''''--'------.............--.......^**^""""::::'''''':::::::^^"""""""""****^*+??++771111LLLI??7?********^^***^""""""""""""^^</w:t>
+        <w:br/>
+        <w:t xml:space="preserve">|-''--''''''''''''':":::::"::''--'-...................-....   .....''':"   ...'''-.-........-.--... . .................   --..............  .............':."*h&lt;^^::':"'. -..... . ............----------...........   . . .....---------''^***""""::::'''':'''':""::":"""""^^^*^^***++??+?11177I??77III*****++***^^****"""""^^^^</w:t>
+        <w:br/>
+        <w:t xml:space="preserve">|'''''''':::::":::::" ..........-................................ ...-''''''''''-------...................   ..   ................................. . ...:''^*1w^^'&lt;^'"'. --.........''...   ....-..----......   ...-.............  ....'.''''****""""::::''''''':':::'"""""^^^*^^*******+????+7I??LL</w:t>
       </w:r>
       <w:r>
         <w:rPr>
@@ -547,7 +609,7 @@
           <w:sz w:val="4"/>
           <w:szCs w:val="4"/>
         </w:rPr>
-        <w:t xml:space="preserve">nn*++***^^^^"^^""::"""""""""""^^^^^^^^^^^""""</w:t>
+        <w:t xml:space="preserve">LIIIIIII++***??********"^^^^</w:t>
       </w:r>
       <w:r>
         <w:rPr>
@@ -560,7 +622,7 @@
           <w:szCs w:val="4"/>
         </w:rPr>
         <w:br/>
-        <w:t xml:space="preserve">|-''-'''------''--''::::::::::.......  ..........................-.......... . ....-.-'''''''------................ . ..   ...-.................   ........ "'      ...'.   .... .........------''''-''---------..... ......-........^^^:::::::''''''::::::^^:""""""****^*??+?77777L</w:t>
+        <w:t xml:space="preserve">|""""""""::.................--......-..--.--..-'---.................'-''':::'''''''''..............................................--.................. .:.:^&lt;*  :'  ':'.. -...........----'''''..............''''.....................-.........****"^"":::::'''''''''"""::^""^"^***********?++***LL</w:t>
       </w:r>
       <w:r>
         <w:rPr>
@@ -572,7 +634,7 @@
           <w:sz w:val="4"/>
           <w:szCs w:val="4"/>
         </w:rPr>
-        <w:t xml:space="preserve">nn?L7n******"^^""^^"""""^^^""""""""^^^^^^^^^"</w:t>
+        <w:t xml:space="preserve">LL77IIII??L7*????LL*******?^</w:t>
       </w:r>
       <w:r>
         <w:rPr>
@@ -585,7 +647,59 @@
           <w:szCs w:val="4"/>
         </w:rPr>
         <w:br/>
-        <w:t xml:space="preserve">|''::::::'''-----..............-.  ...........--.-'-'''--------...........  ......-----''''---...................... ................................... . ': .'':'-. ..............-'. . ......--------...-.....   .. . .....--------'^^^^"""::::'''''''':"::":""""^^**^^***?++??7L</w:t>
+        <w:t xml:space="preserve">|".......--..........-..-..--.'.---'''-''''''---...................'''''''''''''-.....-...................................-...'..''.....................:.':?^-       ::':-.-..................................---'---..............................***^""^^:::::''''''"""::"::^"^^***********^^***??**77IIII??L77LL7?LL*******?^</w:t>
+        <w:br/>
+        <w:t xml:space="preserve">|...-''....'......------'--''''''''''''''''----....................'.'''--'''--....-................................-''-..'''''''''-'-----.--.........''':'*7&lt;^"""'-.'::'::.. ....................................---..........-..-.--'---.............^**+^"""</w:t>
+      </w:r>
+      <w:r>
+        <w:rPr>
+          <w:rFonts w:ascii="Courier New" w:hAnsi="Courier New" w:cs="Courier New"/>
+          <w:b/>
+          <w:bCs/>
+          <w:color w:val="FFD6AA"/>
+          <w:spacing w:val="4"/>
+          <w:sz w:val="4"/>
+          <w:szCs w:val="4"/>
+        </w:rPr>
+        <w:t xml:space="preserve">^::""'':"""'''::":::**^^*******^^****?******II??1nnLL7777h****&lt;&lt;L?</w:t>
+      </w:r>
+      <w:r>
+        <w:rPr>
+          <w:rFonts w:ascii="Courier New" w:hAnsi="Courier New" w:cs="Courier New"/>
+          <w:b/>
+          <w:bCs/>
+          <w:color w:val="FFECCB"/>
+          <w:spacing w:val="4"/>
+          <w:sz w:val="4"/>
+          <w:szCs w:val="4"/>
+        </w:rPr>
+        <w:br/>
+        <w:t xml:space="preserve">|-.....-..........''---'''':':''''''''''--.'........  ....................--.....--....................'''---''''''''''''''''''''''''''''''----.......''^:.?AInh*":--'':':^'. .....................-..................-.-.-..'---'-''.'-.-................++***^^^^"":"""^::':::'::"""^**^^^**^^*************++1nnLL7777</w:t>
+      </w:r>
+      <w:r>
+        <w:rPr>
+          <w:rFonts w:ascii="Courier New" w:hAnsi="Courier New" w:cs="Courier New"/>
+          <w:b/>
+          <w:bCs/>
+          <w:color w:val="FF944C"/>
+          <w:spacing w:val="4"/>
+          <w:sz w:val="4"/>
+          <w:szCs w:val="4"/>
+        </w:rPr>
+        <w:t xml:space="preserve">hhh??&lt;&lt;L?</w:t>
+      </w:r>
+      <w:r>
+        <w:rPr>
+          <w:rFonts w:ascii="Courier New" w:hAnsi="Courier New" w:cs="Courier New"/>
+          <w:b/>
+          <w:bCs/>
+          <w:color w:val="FFECCB"/>
+          <w:spacing w:val="4"/>
+          <w:sz w:val="4"/>
+          <w:szCs w:val="4"/>
+        </w:rPr>
+        <w:br/>
+        <w:t xml:space="preserve">|.......-........''---''''::''''''''''-................................-...---...............---.....'''-'''''''''''':::':::::::::::'':'''''''-.....:^*RI:.^&lt;17*^:'....'':^:. ..................--''...'........---'''-''''''''''''''''''''..................**++*^""""::^":''':'''</w:t>
       </w:r>
       <w:r>
         <w:rPr>
@@ -597,7 +711,7 @@
           <w:sz w:val="4"/>
           <w:szCs w:val="4"/>
         </w:rPr>
-        <w:t xml:space="preserve">nn??7nnnnn**+^^++^^*****^^^^^"""""""""""^^^^"</w:t>
+        <w:t xml:space="preserve">:""""":^^**^^*************++?LL?L7777hhh??&lt;&lt;L?</w:t>
       </w:r>
       <w:r>
         <w:rPr>
@@ -610,7 +724,7 @@
           <w:szCs w:val="4"/>
         </w:rPr>
         <w:br/>
-        <w:t xml:space="preserve">|::::.......................  ............--.---'''''''''---..--....... ...........-....--......................   ................--..--................. ''-::":'.''  ..................----..  .......   ...''-.............. . ...''''^***"""::::'''''':'::'""":^"**^^******???***???</w:t>
+        <w:t xml:space="preserve">|.............''---''''''''''''''----.....................................................'''--....'.-'''''''':::::::::::":"^::"::::::::''''--.....::"^:^":&lt;hA1&lt;^:'''. .'"*'n*:..................-'............--.--.--'''''::'''''''''''---''........ .........+*^""""""^""":'''''::'''</w:t>
       </w:r>
       <w:r>
         <w:rPr>
@@ -622,7 +736,7 @@
           <w:sz w:val="4"/>
           <w:szCs w:val="4"/>
         </w:rPr>
-        <w:t xml:space="preserve">&lt;&lt;Lnnnn?L^++**??*****^^^""^^^^""""""""""</w:t>
+        <w:t xml:space="preserve">":"""*^^^^^*************LL????L7hhhhhL&lt;L?</w:t>
       </w:r>
       <w:r>
         <w:rPr>
@@ -635,7 +749,7 @@
           <w:szCs w:val="4"/>
         </w:rPr>
         <w:br/>
-        <w:t xml:space="preserve">|..--..------..-........  .............--.-----'''''''---..........  .........................................  .-.......--.-...----''--.---.'............-:.:*^^"''':'. -..........................  ................................... . .***^"""::::''''''''"""':"^^""*********^***++*</w:t>
+        <w:t xml:space="preserve">|............--.'''''''''--.''............  ....................................................''...''''''::::::::::::::::"""":::::::::''''.......^ ..'..^7R1"         .:^-''."....................................''---'''''''':''''''''---......................^"""""^"""::""''''''''''</w:t>
       </w:r>
       <w:r>
         <w:rPr>
@@ -647,7 +761,7 @@
           <w:sz w:val="4"/>
           <w:szCs w:val="4"/>
         </w:rPr>
-        <w:t xml:space="preserve">&lt;Lnnnn?LL??L*??***?*^^^^^^^^^""^^^^""""</w:t>
+        <w:t xml:space="preserve">""""":^^^^^^*********++++??LL&lt;&lt;&lt;hhLL7?</w:t>
       </w:r>
       <w:r>
         <w:rPr>
@@ -660,7 +774,7 @@
           <w:szCs w:val="4"/>
         </w:rPr>
         <w:br/>
-        <w:t xml:space="preserve">|'''''''''''''----..  .................-.---------.-...........   .....................................-.... .''-.-'''''''''''''''''''''''--'''--.......  '-:^7+^":''::' -....  ...................   ...........................-..............^*^^"""::::'''''"""'::::""^^^******</w:t>
+        <w:t xml:space="preserve">|...........'--'-------.---............. ......................................................-.-.--'''''''::::::::::::"":::"":::::::'''''---........"1"-^7A"w*^"::'..  ':.-..:...-.....-...........................''''''''''''''''''''''--........................."""^""^"""""""''''''''</w:t>
       </w:r>
       <w:r>
         <w:rPr>
@@ -672,7 +786,7 @@
           <w:sz w:val="4"/>
           <w:szCs w:val="4"/>
         </w:rPr>
-        <w:t xml:space="preserve">^**^*+*****nn?11??LLLLI**??***^^^^^^^^^^^^""""</w:t>
+        <w:t xml:space="preserve">:::":::"^^^^^^******++++****&lt;&lt;&lt;LL777?</w:t>
       </w:r>
       <w:r>
         <w:rPr>
@@ -685,7 +799,32 @@
           <w:szCs w:val="4"/>
         </w:rPr>
         <w:br/>
-        <w:t xml:space="preserve">|::::::''''''''    .........................................  ....... .. ................................  .-..--'''''''''''''::::"::::::::''''--...... .':."*h&lt;^^::':"'. -....  . ................  ....................-...-................   ..^^**":"^::"::"^^'''::':</w:t>
+        <w:t xml:space="preserve">|.....-..........-..--..............  ........................................................---------'''''''::::::":"":":::::::::''''''-''--....--'''*-:"1h +"::'...-   ''. .'''''''-''--------.........-------.----.''''''''''''''''''---..-........  ................^""^^"^^^^""""^'''''::::::"":::^^^^^^**++++*******</w:t>
+      </w:r>
+      <w:r>
+        <w:rPr>
+          <w:rFonts w:ascii="Courier New" w:hAnsi="Courier New" w:cs="Courier New"/>
+          <w:b/>
+          <w:bCs/>
+          <w:color w:val="FF944C"/>
+          <w:spacing w:val="4"/>
+          <w:sz w:val="4"/>
+          <w:szCs w:val="4"/>
+        </w:rPr>
+        <w:t xml:space="preserve">LL77nL</w:t>
+      </w:r>
+      <w:r>
+        <w:rPr>
+          <w:rFonts w:ascii="Courier New" w:hAnsi="Courier New" w:cs="Courier New"/>
+          <w:b/>
+          <w:bCs/>
+          <w:color w:val="FFECCB"/>
+          <w:spacing w:val="4"/>
+          <w:sz w:val="4"/>
+          <w:szCs w:val="4"/>
+        </w:rPr>
+        <w:br/>
+        <w:t xml:space="preserve">|...........................-.......................................................................---'''''''''''':::''''''''''''''''''-----.-----'":.":':&lt;h *'...   .   .'....':'''''''''''''--..................--.-.---.--'--''-----.'..................................*^^+*^^^^^"^^":''':::::::</w:t>
       </w:r>
       <w:r>
         <w:rPr>
@@ -697,7 +836,7 @@
           <w:sz w:val="4"/>
           <w:szCs w:val="4"/>
         </w:rPr>
-        <w:t xml:space="preserve">""^*^^^**^**^****^****+11??LLLLI**??***^^^^^^^^^^***"""</w:t>
+        <w:t xml:space="preserve">::::::^^^^^^^++*********LLnL</w:t>
       </w:r>
       <w:r>
         <w:rPr>
@@ -710,7 +849,7 @@
           <w:szCs w:val="4"/>
         </w:rPr>
         <w:br/>
-        <w:t xml:space="preserve">|"""   .........-...  ...................................  .........    .. ............................ .......--'-''''''''::::::::::::::'''''--..... ...:''^*1w^^'&lt;^'"'. --......................  .-............-..-'-'''-----------..........  ....****^^^":":^^:''::''</w:t>
+        <w:t xml:space="preserve">|...................----...'---.......................................................................-.-----'''''''''''''''''''-----------.........-.  "-^^?.:           . :  :::::::::::::'''''..................-.--...-----.-------..-.............. ......................?*+++^^^**"::"":::::::::::</w:t>
       </w:r>
       <w:r>
         <w:rPr>
@@ -722,7 +861,7 @@
           <w:sz w:val="4"/>
           <w:szCs w:val="4"/>
         </w:rPr>
-        <w:t xml:space="preserve">"""":^^^^^**^**^*^^^**+??++LLLLIII??*****^^^^^^*^******</w:t>
+        <w:t xml:space="preserve">::::""^^^^^^********LLLL</w:t>
       </w:r>
       <w:r>
         <w:rPr>
@@ -735,7 +874,7 @@
           <w:szCs w:val="4"/>
         </w:rPr>
         <w:br/>
-        <w:t xml:space="preserve">|::''''''''--......'''.......................----........................................................-.-...-''''''::::::::::::::::::::'''''''-..... .:.:^&lt;*  :'  ':'.. -....-...............................'-'-'''':::'''''''''---'.................*+*^""""^^":'''''::''</w:t>
+        <w:t xml:space="preserve">|..................''''.................-.-..............................................-''.'.............-.-''''''''''''----'------................^.."'^**'            . "  "::"""""::::::::'........................--..........-..--...............  ........................7++++**^""""::::::::::::::</w:t>
       </w:r>
       <w:r>
         <w:rPr>
@@ -747,7 +886,7 @@
           <w:sz w:val="4"/>
           <w:szCs w:val="4"/>
         </w:rPr>
-        <w:t xml:space="preserve">::"""^^^"^*^^^^^**^**++**??IIILL*****^^^^^^**&lt;&lt;****</w:t>
+        <w:t xml:space="preserve">:"""""^^^^^^^****???L</w:t>
       </w:r>
       <w:r>
         <w:rPr>
@@ -760,7 +899,15 @@
           <w:szCs w:val="4"/>
         </w:rPr>
         <w:br/>
-        <w:t xml:space="preserve">|''''''''''--..-.--.......................-'''................................................................-..'''''''''''''''''''''''''''--..........:.':?^-       ::':-.-.''--'--.-----.......................''--''''::'''''''''---....................^""""^^"::::'''''''''</w:t>
+        <w:t xml:space="preserve">|.............-...................--.-......-.--.......................----..............---..--:::..........--'--'''''--------........'--..--...-.-.-:':-1?^'           .' :  "^""^^""^^^^.......----''...........................................-.................................1++++""^^"::::::::::::::'''""^^""^^^^^^^????</w:t>
+        <w:br/>
+        <w:t xml:space="preserve">|.............................----...-..-----.....................--...................--.-------'-'':''............-.---........:::----------....--7:..'.4n?^"::''      .:.:  ""^^^^^.......::'''---------'-'.................................---....----..............................1++++^""^^:::::::::::''''''^""""""^^^**??</w:t>
+        <w:br/>
+        <w:t xml:space="preserve">|...................--...-------.............-.............--..........................-.-....----------..'-''-'...........-'''--'----------.----..7-'^':.A&lt;^:''-.      .': '  '........""":''''''''''--'..--...--'---............................''''.................---.................7++++^^^^^^:::::::''''''':::""""""**?^</w:t>
+        <w:br/>
+        <w:t xml:space="preserve">|..............----....----'---..........................-.........................................--....-------.....----..-----''---..-...---...777':..^.h*":'-.      ..': .   ...:::"''::'''''''''''-''''---------...........................---...................-.........----...........7+*++?^^^::::::^''''''::::::"""^^^^</w:t>
+        <w:br/>
+        <w:t xml:space="preserve">|-.....----'''----'''''----''-----.-.......--.........-................................................------.......--.-...------''-..--..--...-</w:t>
       </w:r>
       <w:r>
         <w:rPr>
@@ -772,7 +919,7 @@
           <w:sz w:val="4"/>
           <w:szCs w:val="4"/>
         </w:rPr>
-        <w:t xml:space="preserve">"""::"^^""^^^**^******???&lt;&lt;7L*****^^^^****&lt;&lt;****</w:t>
+        <w:t xml:space="preserve">7n7*</w:t>
       </w:r>
       <w:r>
         <w:rPr>
@@ -784,8 +931,33 @@
           <w:sz w:val="4"/>
           <w:szCs w:val="4"/>
         </w:rPr>
-        <w:br/>
-        <w:t xml:space="preserve">|'''''................................................................................................'..............-''''''''''''-'''--------.....-.-''':'*7&lt;^"""'-.'::'::.. :''''''''''''-'......................'''''''''''''''''----.......................""^^"^"^::""''''''</w:t>
+        <w:t xml:space="preserve">-"&lt;":."^^:''-.. ....':- .   --''-'''''::::::''''''''''----.---..--...............................................----..--.--.---.............?+??</w:t>
+      </w:r>
+      <w:r>
+        <w:rPr>
+          <w:rFonts w:ascii="Courier New" w:hAnsi="Courier New" w:cs="Courier New"/>
+          <w:b/>
+          <w:bCs/>
+          <w:color w:val="FFD6AA"/>
+          <w:spacing w:val="4"/>
+          <w:sz w:val="4"/>
+          <w:szCs w:val="4"/>
+        </w:rPr>
+        <w:t xml:space="preserve">&lt;&lt;::^^^:^^^^''':::::::::.^^^</w:t>
+        <w:br/>
+        <w:t xml:space="preserve">|---'''''''--''''''':''''''''''':--'---------............................................................--........-....------'''------..'---''7nIn*:</w:t>
+      </w:r>
+      <w:r>
+        <w:rPr>
+          <w:rFonts w:ascii="Courier New" w:hAnsi="Courier New" w:cs="Courier New"/>
+          <w:b/>
+          <w:bCs/>
+          <w:color w:val="FFECCB"/>
+          <w:spacing w:val="4"/>
+          <w:sz w:val="4"/>
+          <w:szCs w:val="4"/>
+        </w:rPr>
+        <w:t xml:space="preserve">.':'.:^*^*^":...''':'. .   :..'''':::::"::::::::'''''-..-----............................................--..------''.......-...-----..........?</w:t>
       </w:r>
       <w:r>
         <w:rPr>
@@ -797,7 +969,7 @@
           <w:sz w:val="4"/>
           <w:szCs w:val="4"/>
         </w:rPr>
-        <w:t xml:space="preserve">:::::::::""^^^*^**********&lt;77???**^^^^****&lt;&lt;??**</w:t>
+        <w:t xml:space="preserve">&lt;&lt;***^^^^^^^^^^"::::::::....</w:t>
       </w:r>
       <w:r>
         <w:rPr>
@@ -810,7 +982,7 @@
           <w:szCs w:val="4"/>
         </w:rPr>
         <w:br/>
-        <w:t xml:space="preserve">|-.....-...........................................-.--...............................................----'::..........'''''''------'.................''^:.?AInh*":--'':':^'. ::::::::::':''''.......................----'--''----.''........... .................^"^^^^^""""^''''':'':':::':^^^"^**********</w:t>
+        <w:t xml:space="preserve">|'''''''-''''::::::::::'''''''''''''----''.......-.....................................................---'....--....----...----..''''---'''''</w:t>
       </w:r>
       <w:r>
         <w:rPr>
@@ -822,7 +994,7 @@
           <w:sz w:val="4"/>
           <w:szCs w:val="4"/>
         </w:rPr>
-        <w:t xml:space="preserve">&lt;&lt;???**^^^^****L&lt;???h</w:t>
+        <w:t xml:space="preserve">7nII4&lt;* </w:t>
       </w:r>
       <w:r>
         <w:rPr>
@@ -834,8 +1006,9 @@
           <w:sz w:val="4"/>
           <w:szCs w:val="4"/>
         </w:rPr>
-        <w:br/>
-        <w:t xml:space="preserve">|---.........................................'...''.......................................................----'''''........-----........:'''........:^*RI:.^&lt;17*^:'....'':^:. :::::::::::":::................................---................. ...................^***"^^^^"":'':'':''::'::</w:t>
+        <w:t xml:space="preserve">.'-'.-^"*^^^:::::'..      :.--'''''''':::::''''''''---------.............................................--..-------'-............................*****^^^^^^^""""::::::...</w:t>
+        <w:br/>
+        <w:t xml:space="preserve">|'''''::::::::":::":::::''::::':'''-'''..............................................................---'.....''......-''.'''-''''''--''''''</w:t>
       </w:r>
       <w:r>
         <w:rPr>
@@ -847,7 +1020,7 @@
           <w:sz w:val="4"/>
           <w:szCs w:val="4"/>
         </w:rPr>
-        <w:t xml:space="preserve">::"^^^^^******&lt;&lt;???**^^^^****LLhhhh</w:t>
+        <w:t xml:space="preserve">*7IIII4h&lt;?</w:t>
       </w:r>
       <w:r>
         <w:rPr>
@@ -859,8 +1032,9 @@
           <w:sz w:val="4"/>
           <w:szCs w:val="4"/>
         </w:rPr>
-        <w:br/>
-        <w:t xml:space="preserve">|.......................--......''-''-..'''''''''''--..-.......--.....................................................'.........--'''-''-..........::"^:^":&lt;hA1&lt;^:'''. .'"*'n*:"""""^^........-----'.'........................................... ......................**++^*^^:"":'':''::'''</w:t>
+        <w:t xml:space="preserve">. -":'.                .  '...--''''''':::'''''''''---.-''-.........................................--------.''--''''--...........................-..*****^^^^^""""""::::::</w:t>
+        <w:br/>
+        <w:t xml:space="preserve">|::::::":::"""""""""^::'"::::::':'''-.......-..........................................--.........--''''....''.......--''''''''''''::''::'</w:t>
       </w:r>
       <w:r>
         <w:rPr>
@@ -872,7 +1046,7 @@
           <w:sz w:val="4"/>
           <w:szCs w:val="4"/>
         </w:rPr>
-        <w:t xml:space="preserve">::""""^^^^^******??**^^^^**&lt;&lt;77hhhh</w:t>
+        <w:t xml:space="preserve">?&lt;7IIIIIA4I?*</w:t>
       </w:r>
       <w:r>
         <w:rPr>
@@ -884,8 +1058,111 @@
           <w:sz w:val="4"/>
           <w:szCs w:val="4"/>
         </w:rPr>
-        <w:br/>
-        <w:t xml:space="preserve">|.................'-'''--'''''''''''''''''''''''''''''''''...--...................................................................---'''--.........^ ..'..^7R1"         .:^-''."......::::'''-''---.....-'.'.............................---...............................++++^"^^:''::''''''''''</w:t>
+        <w:t xml:space="preserve">..'^^*..- ..         '^^***^^:--''''''''''''''''''----'''--.............................---.-...---''''''----'''''''''''''------......--'..............**++*^^^^^^""""^:::</w:t>
+        <w:br/>
+        <w:t xml:space="preserve">|:::""""^^^""^^^^^^"""::::::::''''........-......................................................--'''.....'......--'''-'''''''''''':::::</w:t>
+      </w:r>
+      <w:r>
+        <w:rPr>
+          <w:rFonts w:ascii="Courier New" w:hAnsi="Courier New" w:cs="Courier New"/>
+          <w:b/>
+          <w:bCs/>
+          <w:color w:val="FFD6AA"/>
+          <w:spacing w:val="4"/>
+          <w:sz w:val="4"/>
+          <w:szCs w:val="4"/>
+        </w:rPr>
+        <w:t xml:space="preserve">*&lt;7IIIIII4R4I?*.-'*1-"1.::        '^&lt;77&lt;&lt;&lt;**^</w:t>
+      </w:r>
+      <w:r>
+        <w:rPr>
+          <w:rFonts w:ascii="Courier New" w:hAnsi="Courier New" w:cs="Courier New"/>
+          <w:b/>
+          <w:bCs/>
+          <w:color w:val="FFECCB"/>
+          <w:spacing w:val="4"/>
+          <w:sz w:val="4"/>
+          <w:szCs w:val="4"/>
+        </w:rPr>
+        <w:t xml:space="preserve">-.--''--''''''''''-----'''--...........................--''------'''''''''--''''''::''''''''''''::-'----------.............+**??^^^^^^"^^^^</w:t>
+        <w:br/>
+        <w:t xml:space="preserve">|^""^^^^^^^^^^^^"""""""":::''''-...-...-........................................................-''''....''....-----''..''''''''''::::::</w:t>
+      </w:r>
+      <w:r>
+        <w:rPr>
+          <w:rFonts w:ascii="Courier New" w:hAnsi="Courier New" w:cs="Courier New"/>
+          <w:b/>
+          <w:bCs/>
+          <w:color w:val="FFD6AA"/>
+          <w:spacing w:val="4"/>
+          <w:sz w:val="4"/>
+          <w:szCs w:val="4"/>
+        </w:rPr>
+        <w:t xml:space="preserve">*77&lt;IIIInIhARR477*.'* :^ "-      '*?nIIn77&lt;&lt;7&lt;:...-.--------'''....--''''--........................''''''''''''''''''''''''''::::::::::::':''':'''''''-'--'-................??**?^^^^**^^</w:t>
+      </w:r>
+      <w:r>
+        <w:rPr>
+          <w:rFonts w:ascii="Courier New" w:hAnsi="Courier New" w:cs="Courier New"/>
+          <w:b/>
+          <w:bCs/>
+          <w:color w:val="FFECCB"/>
+          <w:spacing w:val="4"/>
+          <w:sz w:val="4"/>
+          <w:szCs w:val="4"/>
+        </w:rPr>
+        <w:br/>
+        <w:t xml:space="preserve">|^^^^^^^^^^^^^^""""""::::''''-...-...-.........................................................--''.....-....----......--'''''''''':::::</w:t>
+      </w:r>
+      <w:r>
+        <w:rPr>
+          <w:rFonts w:ascii="Courier New" w:hAnsi="Courier New" w:cs="Courier New"/>
+          <w:b/>
+          <w:bCs/>
+          <w:color w:val="FFD6AA"/>
+          <w:spacing w:val="4"/>
+          <w:sz w:val="4"/>
+          <w:szCs w:val="4"/>
+        </w:rPr>
+        <w:t xml:space="preserve">*77nIIhInII4ARRR477*::::.    ..:^*hRRRAAA4h7nI*:</w:t>
+      </w:r>
+      <w:r>
+        <w:rPr>
+          <w:rFonts w:ascii="Courier New" w:hAnsi="Courier New" w:cs="Courier New"/>
+          <w:b/>
+          <w:bCs/>
+          <w:color w:val="FFECCB"/>
+          <w:spacing w:val="4"/>
+          <w:sz w:val="4"/>
+          <w:szCs w:val="4"/>
+        </w:rPr>
+        <w:t xml:space="preserve">.....--.-----''--------------............--.........:''''''''''''''''''''':::::::::::::::::::''::::':''''''''........-.........*????^***^</w:t>
+        <w:br/>
+        <w:t xml:space="preserve">|^^^^^^^^^^^"""""""::::'''--..--..--....................................''.........--........-'''...........-''........--'''''''':::::::</w:t>
+      </w:r>
+      <w:r>
+        <w:rPr>
+          <w:rFonts w:ascii="Courier New" w:hAnsi="Courier New" w:cs="Courier New"/>
+          <w:b/>
+          <w:bCs/>
+          <w:color w:val="FFD6AA"/>
+          <w:spacing w:val="4"/>
+          <w:sz w:val="4"/>
+          <w:szCs w:val="4"/>
+        </w:rPr>
+        <w:t xml:space="preserve">*77hIIhIInIIIARRRR4In?**:'''':^nhRMMWRRRAA4n7n?:......----'''...''''''..--.............-'''-'........''''''::::::::::::::::::::::::""""""""::::''::::::''-'''--.......--..........???***^</w:t>
+      </w:r>
+      <w:r>
+        <w:rPr>
+          <w:rFonts w:ascii="Courier New" w:hAnsi="Courier New" w:cs="Courier New"/>
+          <w:b/>
+          <w:bCs/>
+          <w:color w:val="FFECCB"/>
+          <w:spacing w:val="4"/>
+          <w:sz w:val="4"/>
+          <w:szCs w:val="4"/>
+        </w:rPr>
+        <w:br/>
+        <w:t xml:space="preserve">|^^^^^^^"""""::::::::''''''--..--..--..................................-...'--.....-'----------............--....--.----''''''''''''::::</w:t>
       </w:r>
       <w:r>
         <w:rPr>
@@ -897,7 +1174,7 @@
           <w:sz w:val="4"/>
           <w:szCs w:val="4"/>
         </w:rPr>
-        <w:t xml:space="preserve">"""::^^^^^*****^^^^^^**&lt;&lt;77LLLh</w:t>
+        <w:t xml:space="preserve">*?nhIIIhhInII4AAARRAAAAhn&lt;7II4ARWWWMMWRRA4In*&lt;&lt;:</w:t>
       </w:r>
       <w:r>
         <w:rPr>
@@ -909,20 +1186,20 @@
           <w:sz w:val="4"/>
           <w:szCs w:val="4"/>
         </w:rPr>
-        <w:br/>
-        <w:t xml:space="preserve">|....''---....''---'''''''''''''::'':::::::::'''''''''''.---........................................................................---..............."1"-^7A"w*^"::'..  ':.-..:':::''''''''''''''--''---......-...........................''''..............................7++*+^""":::::''''''''''</w:t>
-      </w:r>
-      <w:r>
-        <w:rPr>
-          <w:rFonts w:ascii="Courier New" w:hAnsi="Courier New" w:cs="Courier New"/>
-          <w:b/>
-          <w:bCs/>
-          <w:color w:val="FFB878"/>
-          <w:spacing w:val="4"/>
-          <w:sz w:val="4"/>
-          <w:szCs w:val="4"/>
-        </w:rPr>
-        <w:t xml:space="preserve">::""::^**^^*^^^^^^**&lt;&lt;LLLLL&lt;</w:t>
+        <w:t xml:space="preserve">..........--'.........----..............'''''''......:-''''''::::::::::::::::::""""""^""""^^^^""::":::::::::''--.......--............**??</w:t>
+      </w:r>
+      <w:r>
+        <w:rPr>
+          <w:rFonts w:ascii="Courier New" w:hAnsi="Courier New" w:cs="Courier New"/>
+          <w:b/>
+          <w:bCs/>
+          <w:color w:val="FFD6AA"/>
+          <w:spacing w:val="4"/>
+          <w:sz w:val="4"/>
+          <w:szCs w:val="4"/>
+        </w:rPr>
+        <w:br/>
+        <w:t xml:space="preserve">|^^^^"""""::::::''''''''--..--...--------.-.................--...----'''''''''.''''--''-----.............-..--.---------''''''''''''':::^?nhIIII4hhnnnII4AAAhhhn&lt;7IIARRRRRWWMMRAhIn*^^&lt;:</w:t>
       </w:r>
       <w:r>
         <w:rPr>
@@ -934,20 +1211,20 @@
           <w:sz w:val="4"/>
           <w:szCs w:val="4"/>
         </w:rPr>
-        <w:br/>
-        <w:t xml:space="preserve">|.'-'--....----''''''::::::::::::"""""""""""""::::'''''---.....-...............................................---.....-.....--...--..--------------'''*-:"1h +"::'...-   ''. .'''--'''::::::''''-'''--------.--.......................--.......................-.-.............*++**"""^::'::'''''''</w:t>
-      </w:r>
-      <w:r>
-        <w:rPr>
-          <w:rFonts w:ascii="Courier New" w:hAnsi="Courier New" w:cs="Courier New"/>
-          <w:b/>
-          <w:bCs/>
-          <w:color w:val="FFB878"/>
-          <w:spacing w:val="4"/>
-          <w:sz w:val="4"/>
-          <w:szCs w:val="4"/>
-        </w:rPr>
-        <w:t xml:space="preserve">:::":::^^^^^^^:^^^^^*&lt;LL****</w:t>
+        <w:t xml:space="preserve">...........--.........--................-''''''......''''''''::::::::::::"""""""""^^^^^^^^^^^^^^"""""""::::''''--..---..--..............?</w:t>
+      </w:r>
+      <w:r>
+        <w:rPr>
+          <w:rFonts w:ascii="Courier New" w:hAnsi="Courier New" w:cs="Courier New"/>
+          <w:b/>
+          <w:bCs/>
+          <w:color w:val="FFD6AA"/>
+          <w:spacing w:val="4"/>
+          <w:sz w:val="4"/>
+          <w:szCs w:val="4"/>
+        </w:rPr>
+        <w:br/>
+        <w:t xml:space="preserve">|:"":::::''::::'''''''-....-..--''--------........-...-....''..---''::'''''''''''''''''----.............----''--..----..'''''''''''''''*^?&lt;IInIIh44hhn77II4hIInnnI4AA444ARRRWMR4hI7*::**:</w:t>
       </w:r>
       <w:r>
         <w:rPr>
@@ -959,34 +1236,20 @@
           <w:sz w:val="4"/>
           <w:szCs w:val="4"/>
         </w:rPr>
-        <w:br/>
-        <w:t xml:space="preserve">|-.....'----''''''::::::::""""""""""""""""""""::::'''--..--..-.....................................-........---'....''......-----'---'''''---'''-'''":.":':&lt;h *'...   .   .'....-----''':::'''''''----..---................................................----.-......-...........****+^"":::::"'''':::::::^^^^^:^:::"^^**??****</w:t>
-        <w:br/>
-        <w:t xml:space="preserve">|...------'''''''::::::::"""""""""""""""""::::''''--......-................................................--'.....'.....----------'--'''':::''''''''.  "-^^?.:           . :  ...-''''''''''''''-----..---.........................................---.-------......-----............*++??:""":""""':::::::...^^::'':"^^^^??****</w:t>
-        <w:br/>
-        <w:t xml:space="preserve">|---------''''''':::::""""""""""""""::::::''''''-----.--................................-................--'.....-....--.-.--.-'---''''':::::::'::'''^.."'^**'            . "  ....-''''''---'''-----------......................................-----...--------........................??***""^^^""::":::::....::''''"^^^**^^**</w:t>
-        <w:br/>
-        <w:t xml:space="preserve">|--..----'''''':'::::::::::""::::::::'''''''-''---..--.-------.-.....................--..---...--.--..----.........----......--''---'''''::::::::''''-:':-1?^'           .' :  .......-----------..--------........................--------.----'''''---'''''-------..-....................-****^^^^^":"":::::::.::''''""^^^*^^^^</w:t>
-        <w:br/>
-        <w:t xml:space="preserve">|...-----'''''''''':'::''''''''''''''''''-----....-------------.....--.......'..--'''-''----------------..........---...------'''-'''''''::''::'''''7:..'.4n?^"::''      .:.:  ..........-.--------.---------......................----------'''''''---''''''''''--'---------..-----...........*^***^""^^:::^^:::::''''::^^^^""^^</w:t>
-        <w:br/>
-        <w:t xml:space="preserve">|.....-.-----''''''''''''''''''''--'''------...------------'---------''---'''''''''''''''''''''-'---............-------..---..'''--''''''''''''''''7-'^':.A&lt;^:''-.      .': '  ...........-----....-----.--.............---......''--'-'--''''''''''''''::::::::::''''''''''''''------......--....*****^^^^^^^^^^:::::"::...^""""</w:t>
-        <w:br/>
-        <w:t xml:space="preserve">|.........-''''''''''''''--------------.............---''''''''''''::'':::':::::::::::'''''''''''''-..............--..-------.--'''''''''''''''-'777':..^.h*":'-.      ..': .   .............--.......----.............-'---......'''--'''''''::''':::::::::::::::::::::'''''''''------......--......*****^^**^^^::^::":::...:::"</w:t>
-        <w:br/>
-        <w:t xml:space="preserve">|.......--''--'''''------------.........--..............'''''''::''::::::::::""::""::::::::::'''''....................---....--'-------''------.</w:t>
-      </w:r>
-      <w:r>
-        <w:rPr>
-          <w:rFonts w:ascii="Courier New" w:hAnsi="Courier New" w:cs="Courier New"/>
-          <w:b/>
-          <w:bCs/>
-          <w:color w:val="FFB878"/>
-          <w:spacing w:val="4"/>
-          <w:sz w:val="4"/>
-          <w:szCs w:val="4"/>
-        </w:rPr>
-        <w:t xml:space="preserve">7n7*</w:t>
+        <w:t xml:space="preserve">.........................................'''''......''-''''':::::::::::::"""""^^^""^^^^^^^^^^^^^"""""""":::::''--..--...-...............</w:t>
+      </w:r>
+      <w:r>
+        <w:rPr>
+          <w:rFonts w:ascii="Courier New" w:hAnsi="Courier New" w:cs="Courier New"/>
+          <w:b/>
+          <w:bCs/>
+          <w:color w:val="FFD6AA"/>
+          <w:spacing w:val="4"/>
+          <w:sz w:val="4"/>
+          <w:szCs w:val="4"/>
+        </w:rPr>
+        <w:br/>
+        <w:t xml:space="preserve">|:':::''::''''''----.....''------'-''--'''..--..-----'''''''''''':::::''::'''''''''''''--...............-.---.---------..''..'''''''''&lt;&lt;^*?&lt;nn77nIhh4A4I7&lt;nnnnIh4hh4444AA4ARRR4hIn&lt;</w:t>
       </w:r>
       <w:r>
         <w:rPr>
@@ -998,21 +1261,20 @@
           <w:sz w:val="4"/>
           <w:szCs w:val="4"/>
         </w:rPr>
-        <w:t xml:space="preserve">-"&lt;":."^^:''-.. ....':- .   .......................--..............''''-......'--''''''':::::::::::::::"""::""""""""::::'''''''''--.......-.........******^^^^:^^^^::::::::::</w:t>
-        <w:br/>
-        <w:t xml:space="preserve">|:.........-'.'''''''''.........''''-..--....-''...........'.:::::::"::::""""""""""""""""""::""::.......................--...-.--'-..'''''''..'</w:t>
-      </w:r>
-      <w:r>
-        <w:rPr>
-          <w:rFonts w:ascii="Courier New" w:hAnsi="Courier New" w:cs="Courier New"/>
-          <w:b/>
-          <w:bCs/>
-          <w:color w:val="FFB878"/>
-          <w:spacing w:val="4"/>
-          <w:sz w:val="4"/>
-          <w:szCs w:val="4"/>
-        </w:rPr>
-        <w:t xml:space="preserve">7nIn*:</w:t>
+        <w:t xml:space="preserve">*.':*:.....................-...................----'.....''--'--'''':::::::"""":"""""""""^^^^^^^^^^^^^^""""""""::::''--...--...-..............</w:t>
+      </w:r>
+      <w:r>
+        <w:rPr>
+          <w:rFonts w:ascii="Courier New" w:hAnsi="Courier New" w:cs="Courier New"/>
+          <w:b/>
+          <w:bCs/>
+          <w:color w:val="FFD6AA"/>
+          <w:spacing w:val="4"/>
+          <w:sz w:val="4"/>
+          <w:szCs w:val="4"/>
+        </w:rPr>
+        <w:br/>
+        <w:t xml:space="preserve">|''''''''''''------...----''''---''''''''------'::'''''''::::'::::::::::::::::::'''''''--........................--..----''''''''''''*I?:*??&lt;7777nIh44II7nn4444hh44AA4hI44AARAhIn7&lt;</w:t>
       </w:r>
       <w:r>
         <w:rPr>
@@ -1024,21 +1286,20 @@
           <w:sz w:val="4"/>
           <w:szCs w:val="4"/>
         </w:rPr>
-        <w:t xml:space="preserve">.':'.:^*^*^":...''':'. .   :......................-...............--'''......''''''':::::::::::"""""""""^^^^^^^^^^^^""""::::::'''''.......--..........*****^^^^^^^""^^::::::</w:t>
-        <w:br/>
-        <w:t xml:space="preserve">|.''-'-.................:::::-----------..-.---'.''.'..........."""::""^^^^^^^^^^^^^^^^^^^................................--...........--'--..</w:t>
-      </w:r>
-      <w:r>
-        <w:rPr>
-          <w:rFonts w:ascii="Courier New" w:hAnsi="Courier New" w:cs="Courier New"/>
-          <w:b/>
-          <w:bCs/>
-          <w:color w:val="FFB878"/>
-          <w:spacing w:val="4"/>
-          <w:sz w:val="4"/>
-          <w:szCs w:val="4"/>
-        </w:rPr>
-        <w:t xml:space="preserve">7nII4&lt;* </w:t>
+        <w:t xml:space="preserve">^...^:..........................................-----.....'--'''''''''::::::"""::"""""""""""^^^^^^^^^^^^^""""":::::'''''''......-.............</w:t>
+      </w:r>
+      <w:r>
+        <w:rPr>
+          <w:rFonts w:ascii="Courier New" w:hAnsi="Courier New" w:cs="Courier New"/>
+          <w:b/>
+          <w:bCs/>
+          <w:color w:val="FFD6AA"/>
+          <w:spacing w:val="4"/>
+          <w:sz w:val="4"/>
+          <w:szCs w:val="4"/>
+        </w:rPr>
+        <w:br/>
+        <w:t xml:space="preserve">|'''''''''''-'--.....'...''''''''''''''''-'''''::'':::::::::::::::"::""::::"::::::'''''........................----....---'-'''''''''*7^:^**?&lt;&lt;&lt;777IIIInnI4IIII44ARRRR44IIAAA4Inn&lt;?^.. ^:</w:t>
       </w:r>
       <w:r>
         <w:rPr>
@@ -1050,7 +1311,7 @@
           <w:sz w:val="4"/>
           <w:szCs w:val="4"/>
         </w:rPr>
-        <w:t xml:space="preserve">.'-'.-^"*^^^:::::'..      :........................................---......'''--'''':::::::""::"""^^^"^^^^^^^^^^^^^"""""""::::'''....-...-.............***^^^^^^^"^^^^":::</w:t>
+        <w:t xml:space="preserve">.....................................................'-''--''''''''':::::::::""""""^^^"^^^^^^^^^^""""""::::::::''''''''--..--.----.-....</w:t>
       </w:r>
       <w:r>
         <w:rPr>
@@ -1063,7 +1324,7 @@
           <w:szCs w:val="4"/>
         </w:rPr>
         <w:br/>
-        <w:t xml:space="preserve">|---''..........-'''''''''''------.-.----........---''''...........::::^^^^^^^^^^^^..........'''''''''.'....................................*7IIII4h&lt;?</w:t>
+        <w:t xml:space="preserve">|'''''''''''............--.--''::::'::::'::::::"""""""""""""^^^^^^^^^^^^^^^"""""""::..........-...-.--....-------''-------'-''---''''*?^:^***?&lt;&lt;&lt;77nn&lt;nIIIhhhIIAARRWRRA4II4A44I77&lt;^".::</w:t>
       </w:r>
       <w:r>
         <w:rPr>
@@ -1075,21 +1336,20 @@
           <w:sz w:val="4"/>
           <w:szCs w:val="4"/>
         </w:rPr>
-        <w:t xml:space="preserve">. -":'.                .  '.................................................'''--'''''''':::""::"""""""""^^^^^^^^^^^"""""""":::'''-.......--...............^^^^^^^^^^^^""""</w:t>
-        <w:br/>
-        <w:t xml:space="preserve">|--.......----..--'''''''....---.----.--......-......------...........:.::^^.........."::::'''''''--'-''''''..............................</w:t>
-      </w:r>
-      <w:r>
-        <w:rPr>
-          <w:rFonts w:ascii="Courier New" w:hAnsi="Courier New" w:cs="Courier New"/>
-          <w:b/>
-          <w:bCs/>
-          <w:color w:val="FFB878"/>
-          <w:spacing w:val="4"/>
-          <w:sz w:val="4"/>
-          <w:szCs w:val="4"/>
-        </w:rPr>
-        <w:t xml:space="preserve">?&lt;7IIIIIA4I?*</w:t>
+        <w:t xml:space="preserve">..............----.--......................--''-......''''''''''''''''::::::"""^^^^^^^^^^^^^^^^^^^^^^^^^^""""":::::''''''''..''--'''''''''</w:t>
+      </w:r>
+      <w:r>
+        <w:rPr>
+          <w:rFonts w:ascii="Courier New" w:hAnsi="Courier New" w:cs="Courier New"/>
+          <w:b/>
+          <w:bCs/>
+          <w:color w:val="FFD6AA"/>
+          <w:spacing w:val="4"/>
+          <w:sz w:val="4"/>
+          <w:szCs w:val="4"/>
+        </w:rPr>
+        <w:br/>
+        <w:t xml:space="preserve">|''''.......................-----::::'':::"":"^^""^^^""^^^^^^^^^^^^^^^^^^^^^^^"^^^::.........-.---.-...........--'--''--..---------''*^'':^****?&lt;&lt;&lt;&lt;&lt;&lt;nnIIIhhnInh4AARRAI7Ih44hI7&lt;?^".</w:t>
       </w:r>
       <w:r>
         <w:rPr>
@@ -1101,314 +1361,7 @@
           <w:sz w:val="4"/>
           <w:szCs w:val="4"/>
         </w:rPr>
-        <w:t xml:space="preserve">..'^^*..- ..         '^^***^^:.............................................--'--'---'''''':'::::"""""^^^^"^^^^^^^^^""""":::::::''''''.....--.................^^^^^^^**^"""</w:t>
-        <w:br/>
-        <w:t xml:space="preserve">|......--.-....--''''''''.....-----.--...------...........-.--.................^^^^^:'''''''''''''.'..--..--'-''.........................</w:t>
-      </w:r>
-      <w:r>
-        <w:rPr>
-          <w:rFonts w:ascii="Courier New" w:hAnsi="Courier New" w:cs="Courier New"/>
-          <w:b/>
-          <w:bCs/>
-          <w:color w:val="FFD6AA"/>
-          <w:spacing w:val="4"/>
-          <w:sz w:val="4"/>
-          <w:szCs w:val="4"/>
-        </w:rPr>
-        <w:t xml:space="preserve">*&lt;7IIIIII4R4I?*.-'*1-"1.::        '^&lt;77&lt;&lt;&lt;**^</w:t>
-      </w:r>
-      <w:r>
-        <w:rPr>
-          <w:rFonts w:ascii="Courier New" w:hAnsi="Courier New" w:cs="Courier New"/>
-          <w:b/>
-          <w:bCs/>
-          <w:color w:val="FFECCB"/>
-          <w:spacing w:val="4"/>
-          <w:sz w:val="4"/>
-          <w:szCs w:val="4"/>
-        </w:rPr>
-        <w:t xml:space="preserve">.............................................-'--''----'''''::::::::""""""^"^""""^^^^""""":::::'''''''''-...-----...............^^^****^^^^</w:t>
-        <w:br/>
-        <w:t xml:space="preserve">|...--....------.''''----------.-..----'''''''''........................'::::::::::::::::'''''''''''''''...-..--..--....................</w:t>
-      </w:r>
-      <w:r>
-        <w:rPr>
-          <w:rFonts w:ascii="Courier New" w:hAnsi="Courier New" w:cs="Courier New"/>
-          <w:b/>
-          <w:bCs/>
-          <w:color w:val="FFD6AA"/>
-          <w:spacing w:val="4"/>
-          <w:sz w:val="4"/>
-          <w:szCs w:val="4"/>
-        </w:rPr>
-        <w:t xml:space="preserve">*77&lt;IIIInIhARR477*.'* :^ "-      '*?nIIn77&lt;&lt;7&lt;:</w:t>
-      </w:r>
-      <w:r>
-        <w:rPr>
-          <w:rFonts w:ascii="Courier New" w:hAnsi="Courier New" w:cs="Courier New"/>
-          <w:b/>
-          <w:bCs/>
-          <w:color w:val="FFECCB"/>
-          <w:spacing w:val="4"/>
-          <w:sz w:val="4"/>
-          <w:szCs w:val="4"/>
-        </w:rPr>
-        <w:t xml:space="preserve">................................................''....--'''''''':::::":::""::""":::::::::::'::::''''''''-...-----------.-.........****??^^</w:t>
-        <w:br/>
-        <w:t xml:space="preserve">|....----...------------.-''--''''-'''--''''''''.....................-.''''''::::::::::::''''''''''''---''''''..........................</w:t>
-      </w:r>
-      <w:r>
-        <w:rPr>
-          <w:rFonts w:ascii="Courier New" w:hAnsi="Courier New" w:cs="Courier New"/>
-          <w:b/>
-          <w:bCs/>
-          <w:color w:val="FFD6AA"/>
-          <w:spacing w:val="4"/>
-          <w:sz w:val="4"/>
-          <w:szCs w:val="4"/>
-        </w:rPr>
-        <w:t xml:space="preserve">*77nIIhInII4ARRR477*::::.    ..:^*hRRRAAA4h7nI*:</w:t>
-      </w:r>
-      <w:r>
-        <w:rPr>
-          <w:rFonts w:ascii="Courier New" w:hAnsi="Courier New" w:cs="Courier New"/>
-          <w:b/>
-          <w:bCs/>
-          <w:color w:val="FFECCB"/>
-          <w:spacing w:val="4"/>
-          <w:sz w:val="4"/>
-          <w:szCs w:val="4"/>
-        </w:rPr>
-        <w:t xml:space="preserve">.......................................................''--''''''''':'::::::::::::::'''':'''::'''''-----...------'-''------.......-.*????</w:t>
-      </w:r>
-      <w:r>
-        <w:rPr>
-          <w:rFonts w:ascii="Courier New" w:hAnsi="Courier New" w:cs="Courier New"/>
-          <w:b/>
-          <w:bCs/>
-          <w:color w:val="FFD6AA"/>
-          <w:spacing w:val="4"/>
-          <w:sz w:val="4"/>
-          <w:szCs w:val="4"/>
-        </w:rPr>
-        <w:br/>
-        <w:t xml:space="preserve">|....--....--......''-'--''''''''''''----''''--........................'''':::::""::::::':''''''----..---...--..........................*77hIIhIInIIIARRRR4In?**:'''':^nhRMMWRRRAA4n7n?:</w:t>
-      </w:r>
-      <w:r>
-        <w:rPr>
-          <w:rFonts w:ascii="Courier New" w:hAnsi="Courier New" w:cs="Courier New"/>
-          <w:b/>
-          <w:bCs/>
-          <w:color w:val="FFECCB"/>
-          <w:spacing w:val="4"/>
-          <w:sz w:val="4"/>
-          <w:szCs w:val="4"/>
-        </w:rPr>
-        <w:t xml:space="preserve">...........................................................-.--'''''''''''::::''''''''''''''''''''''------..--'-''------''''''.---..---??</w:t>
-        <w:br/>
-        <w:t xml:space="preserve">|.--''''''''''''''--''''''''''''''''''''-'--........................--''''''::::::::::::::''''--..------................................</w:t>
-      </w:r>
-      <w:r>
-        <w:rPr>
-          <w:rFonts w:ascii="Courier New" w:hAnsi="Courier New" w:cs="Courier New"/>
-          <w:b/>
-          <w:bCs/>
-          <w:color w:val="FFD6AA"/>
-          <w:spacing w:val="4"/>
-          <w:sz w:val="4"/>
-          <w:szCs w:val="4"/>
-        </w:rPr>
-        <w:t xml:space="preserve">*?nhIIIhhInII4AAARRAAAAhn&lt;7II4ARWWWMMWRRA4In*&lt;&lt;:..............................-..............--''.'..............-.--''''''::''''''''''''''''''''''''''''--....''..''''''''''''''-----'::</w:t>
-      </w:r>
-      <w:r>
-        <w:rPr>
-          <w:rFonts w:ascii="Courier New" w:hAnsi="Courier New" w:cs="Courier New"/>
-          <w:b/>
-          <w:bCs/>
-          <w:color w:val="FFECCB"/>
-          <w:spacing w:val="4"/>
-          <w:sz w:val="4"/>
-          <w:szCs w:val="4"/>
-        </w:rPr>
-        <w:br/>
-        <w:t xml:space="preserve">|-'''''''''''''::''::''''''''''''''''''''.............................''''''''::::::''''''''----.-----..................................</w:t>
-      </w:r>
-      <w:r>
-        <w:rPr>
-          <w:rFonts w:ascii="Courier New" w:hAnsi="Courier New" w:cs="Courier New"/>
-          <w:b/>
-          <w:bCs/>
-          <w:color w:val="FFD6AA"/>
-          <w:spacing w:val="4"/>
-          <w:sz w:val="4"/>
-          <w:szCs w:val="4"/>
-        </w:rPr>
-        <w:t xml:space="preserve">^?nhIIII4hhnnnII4AAAhhhn&lt;7IIARRRRRWWMMRAhIn*^^&lt;:........................''''-...............-.--'''.''................--'''''''''''''''''''--------''''..................''''''''''''''''</w:t>
-      </w:r>
-      <w:r>
-        <w:rPr>
-          <w:rFonts w:ascii="Courier New" w:hAnsi="Courier New" w:cs="Courier New"/>
-          <w:b/>
-          <w:bCs/>
-          <w:color w:val="FFECCB"/>
-          <w:spacing w:val="4"/>
-          <w:sz w:val="4"/>
-          <w:szCs w:val="4"/>
-        </w:rPr>
-        <w:br/>
-        <w:t xml:space="preserve">|-''''''''''''::::::::::''':::'''''''''............................--''''''''':::'''''''''----..-'--...................................</w:t>
-      </w:r>
-      <w:r>
-        <w:rPr>
-          <w:rFonts w:ascii="Courier New" w:hAnsi="Courier New" w:cs="Courier New"/>
-          <w:b/>
-          <w:bCs/>
-          <w:color w:val="FFB878"/>
-          <w:spacing w:val="4"/>
-          <w:sz w:val="4"/>
-          <w:szCs w:val="4"/>
-        </w:rPr>
-        <w:t xml:space="preserve">*^?&lt;IInIIh44hhn77II4hIInnnI4AA444ARRRWMR4hI7*::**:</w:t>
-      </w:r>
-      <w:r>
-        <w:rPr>
-          <w:rFonts w:ascii="Courier New" w:hAnsi="Courier New" w:cs="Courier New"/>
-          <w:b/>
-          <w:bCs/>
-          <w:color w:val="FFECCB"/>
-          <w:spacing w:val="4"/>
-          <w:sz w:val="4"/>
-          <w:szCs w:val="4"/>
-        </w:rPr>
-        <w:t xml:space="preserve">....................----.......................--'''''':-::..............-''''''''''''''''''''-----...........-..............'.'''''''''</w:t>
-        <w:br/>
-        <w:t xml:space="preserve">|'--'''''''::::::::::::::::'''''''''..''...........................--'''''''''''''''''''''--------....................................</w:t>
-      </w:r>
-      <w:r>
-        <w:rPr>
-          <w:rFonts w:ascii="Courier New" w:hAnsi="Courier New" w:cs="Courier New"/>
-          <w:b/>
-          <w:bCs/>
-          <w:color w:val="FF944C"/>
-          <w:spacing w:val="4"/>
-          <w:sz w:val="4"/>
-          <w:szCs w:val="4"/>
-        </w:rPr>
-        <w:t xml:space="preserve">&lt;&lt;^*?&lt;nn77nIhh4A4I7&lt;nnnnIh4hh4444AA4ARRR4hIn&lt;</w:t>
-      </w:r>
-      <w:r>
-        <w:rPr>
-          <w:rFonts w:ascii="Courier New" w:hAnsi="Courier New" w:cs="Courier New"/>
-          <w:b/>
-          <w:bCs/>
-          <w:color w:val="FFECCB"/>
-          <w:spacing w:val="4"/>
-          <w:sz w:val="4"/>
-          <w:szCs w:val="4"/>
-        </w:rPr>
-        <w:t xml:space="preserve">*.':*:..............-...............................--...----'''''':'::...........--'-''''''''''''''-...........'------....--.............'.''</w:t>
-        <w:br/>
-        <w:t xml:space="preserve">|'''''''''::::::::::::::::'''''''''''..............................-.--''--''''''''''-------'''---...................................</w:t>
-      </w:r>
-      <w:r>
-        <w:rPr>
-          <w:rFonts w:ascii="Courier New" w:hAnsi="Courier New" w:cs="Courier New"/>
-          <w:b/>
-          <w:bCs/>
-          <w:color w:val="FFD6AA"/>
-          <w:spacing w:val="4"/>
-          <w:sz w:val="4"/>
-          <w:szCs w:val="4"/>
-        </w:rPr>
-        <w:t xml:space="preserve">*I?:*??&lt;7777nIh44II7nn4444hh44AA4hI44AARAhIn7&lt;^...^:................................................--......---''''''''::''...-.........'.'''''...........:::''----.......--..''''..........</w:t>
-      </w:r>
-      <w:r>
-        <w:rPr>
-          <w:rFonts w:ascii="Courier New" w:hAnsi="Courier New" w:cs="Courier New"/>
-          <w:b/>
-          <w:bCs/>
-          <w:color w:val="FFECCB"/>
-          <w:spacing w:val="4"/>
-          <w:sz w:val="4"/>
-          <w:szCs w:val="4"/>
-        </w:rPr>
-        <w:br/>
-        <w:t xml:space="preserve">|''''':::::::::::::::::'''''''''...............  ...................-------'''-'''''.-----''''--................................-----</w:t>
-      </w:r>
-      <w:r>
-        <w:rPr>
-          <w:rFonts w:ascii="Courier New" w:hAnsi="Courier New" w:cs="Courier New"/>
-          <w:b/>
-          <w:bCs/>
-          <w:color w:val="FFB878"/>
-          <w:spacing w:val="4"/>
-          <w:sz w:val="4"/>
-          <w:szCs w:val="4"/>
-        </w:rPr>
-        <w:t xml:space="preserve">*7^:^**?&lt;&lt;&lt;777IIIInnI4IIII44ARRRR44IIAAA4Inn&lt;?^.. ^:</w:t>
-      </w:r>
-      <w:r>
-        <w:rPr>
-          <w:rFonts w:ascii="Courier New" w:hAnsi="Courier New" w:cs="Courier New"/>
-          <w:b/>
-          <w:bCs/>
-          <w:color w:val="FFECCB"/>
-          <w:spacing w:val="4"/>
-          <w:sz w:val="4"/>
-          <w:szCs w:val="4"/>
-        </w:rPr>
-        <w:t xml:space="preserve">.............--.....................................--....-------''--''..''----....................::::::-------------..-.----'..''.'...</w:t>
-        <w:br/>
-        <w:t xml:space="preserve">|'''::::::"""""""":::::::::''''--..---.......................---------''--'''''''''--..'''''''''--.......----...............--'''''''</w:t>
-      </w:r>
-      <w:r>
-        <w:rPr>
-          <w:rFonts w:ascii="Courier New" w:hAnsi="Courier New" w:cs="Courier New"/>
-          <w:b/>
-          <w:bCs/>
-          <w:color w:val="FFD6AA"/>
-          <w:spacing w:val="4"/>
-          <w:sz w:val="4"/>
-          <w:szCs w:val="4"/>
-        </w:rPr>
-        <w:t xml:space="preserve">*?^:^***?&lt;&lt;&lt;77nn&lt;nIIIhhhIIAARRWRRA4II4A44I77&lt;^".::.'''------....'''-.............................--..-....------'.--'''''--''--'''''''.............''''::'''''''''--''--'''''''--------'''''</w:t>
-      </w:r>
-      <w:r>
-        <w:rPr>
-          <w:rFonts w:ascii="Courier New" w:hAnsi="Courier New" w:cs="Courier New"/>
-          <w:b/>
-          <w:bCs/>
-          <w:color w:val="FFECCB"/>
-          <w:spacing w:val="4"/>
-          <w:sz w:val="4"/>
-          <w:szCs w:val="4"/>
-        </w:rPr>
-        <w:br/>
-        <w:t xml:space="preserve">|'::::::"::::"::::::::''''''--...........--................-.---------''''''''''''''''''''''''----.........--..--..........''''''''''*^'':^****?</w:t>
-      </w:r>
-      <w:r>
-        <w:rPr>
-          <w:rFonts w:ascii="Courier New" w:hAnsi="Courier New" w:cs="Courier New"/>
-          <w:b/>
-          <w:bCs/>
-          <w:color w:val="FF944C"/>
-          <w:spacing w:val="4"/>
-          <w:sz w:val="4"/>
-          <w:szCs w:val="4"/>
-        </w:rPr>
-        <w:t xml:space="preserve">&lt;&lt;&lt;&lt;&lt;&lt;nnIIIhhnInh4AARRAI7Ih44hI7&lt;?^".</w:t>
-      </w:r>
-      <w:r>
-        <w:rPr>
-          <w:rFonts w:ascii="Courier New" w:hAnsi="Courier New" w:cs="Courier New"/>
-          <w:b/>
-          <w:bCs/>
-          <w:color w:val="FFECCB"/>
-          <w:spacing w:val="4"/>
-          <w:sz w:val="4"/>
-          <w:szCs w:val="4"/>
-        </w:rPr>
-        <w:t xml:space="preserve">..'''''---......''--....---................................--.----.-..--.--..--'''''''''.......'''''''''''''''''--..'''''''--''''-------''--</w:t>
+        <w:t xml:space="preserve">...............................................----.....--'''''''''''''''':::::::""""^^^^^^^^^^^^^^^"""^^""""":::::::::'''''''....--''''''''</w:t>
       </w:r>
       <w:r>
         <w:rPr>
@@ -8856,7 +8809,7 @@
       <w:r>
         <w:t xml:space="preserve"> game: id Software’s Doom engine — GPL-2.0, compiled to JavaScript by </w:t>
       </w:r>
-      <w:hyperlink xmlns:p4="http://schemas.openxmlformats.org/officeDocument/2006/relationships" p4:id="Rd85a93b8edc44cb1">
+      <w:hyperlink xmlns:p4="http://schemas.openxmlformats.org/officeDocument/2006/relationships" p4:id="Rf4e5fca064ff46e7">
         <w:r>
           <w:t xml:space="preserve">doomgeneric</w:t>
         </w:r>

</xml_diff>